<commit_message>
fixed up to 9 again and cleaned - need to work on stats vignettes
</commit_message>
<xml_diff>
--- a/docs/ecostats_lectures/lecture_09/09_01_lecture_powerpoint.docx
+++ b/docs/ecostats_lectures/lecture_09/09_01_lecture_powerpoint.docx
@@ -152,7 +152,7 @@
       <w:r>
         <w:drawing>
           <wp:inline>
-            <wp:extent cx="3657600" cy="4572000"/>
+            <wp:extent cx="2743200" cy="2743200"/>
             <wp:effectExtent b="0" l="0" r="0" t="0"/>
             <wp:docPr descr="" title="" id="21" name="Picture"/>
             <a:graphic>
@@ -173,7 +173,7 @@
                   <pic:spPr bwMode="auto">
                     <a:xfrm>
                       <a:off x="0" y="0"/>
-                      <a:ext cx="3657600" cy="4572000"/>
+                      <a:ext cx="2743200" cy="2743200"/>
                     </a:xfrm>
                     <a:prstGeom prst="rect">
                       <a:avLst/>
@@ -1291,13 +1291,7 @@
         </w:numPr>
       </w:pPr>
       <w:r>
-        <w:t xml:space="preserve">This is r (not rho as Spearman nonparticipant below), as indicated</w:t>
-      </w:r>
-      <w:r>
-        <w:t xml:space="preserve"> </w:t>
-      </w:r>
-      <w:r>
-        <w:t xml:space="preserve">by</w:t>
+        <w:t xml:space="preserve">This is r (not rho as Spearman nonparametric below), as indicated by</w:t>
       </w:r>
       <w:r>
         <w:t xml:space="preserve"> </w:t>
@@ -1349,13 +1343,13 @@
       </w:r>
     </w:p>
     <w:bookmarkEnd w:id="36"/>
-    <w:bookmarkStart w:id="37" w:name="note-texttfracrse_r"/>
+    <w:bookmarkStart w:id="37" w:name="note-that-it-is-tested-by-texttfracrse_r"/>
     <w:p>
       <w:pPr>
         <w:pStyle w:val="Heading3"/>
       </w:pPr>
       <w:r>
-        <w:t xml:space="preserve">Note</w:t>
+        <w:t xml:space="preserve">Note that it is tested by:</w:t>
       </w:r>
       <w:r>
         <w:t xml:space="preserve"> </w:t>
@@ -1851,13 +1845,7 @@
         <w:pStyle w:val="FirstParagraph"/>
       </w:pPr>
       <w:r>
-        <w:t xml:space="preserve">Let’s check these assumptions using the lion data from Example 17.1 Lion</w:t>
-      </w:r>
-      <w:r>
-        <w:t xml:space="preserve"> </w:t>
-      </w:r>
-      <w:r>
-        <w:t xml:space="preserve">Noses:</w:t>
+        <w:t xml:space="preserve">Let’s check these assumptions booby data:</w:t>
       </w:r>
     </w:p>
     <w:bookmarkEnd w:id="46"/>
@@ -1884,7 +1872,7 @@
         <w:rPr>
           <w:rStyle w:val="VerbatimChar"/>
         </w:rPr>
-        <w:t xml:space="preserve">data:  lion_data$proportion_black</w:t>
+        <w:t xml:space="preserve">data:  booby_data$visits_as_nestling</w:t>
       </w:r>
       <w:r>
         <w:br/>
@@ -1893,7 +1881,7 @@
         <w:rPr>
           <w:rStyle w:val="VerbatimChar"/>
         </w:rPr>
-        <w:t xml:space="preserve">W = 0.88895, p-value = 0.003279</w:t>
+        <w:t xml:space="preserve">W = 0.95783, p-value = 0.3965</w:t>
       </w:r>
     </w:p>
     <w:p>
@@ -1919,7 +1907,7 @@
         <w:rPr>
           <w:rStyle w:val="VerbatimChar"/>
         </w:rPr>
-        <w:t xml:space="preserve">data:  lion_data$age_years</w:t>
+        <w:t xml:space="preserve">data:  booby_data$future_aggression</w:t>
       </w:r>
       <w:r>
         <w:br/>
@@ -1928,7 +1916,7 @@
         <w:rPr>
           <w:rStyle w:val="VerbatimChar"/>
         </w:rPr>
-        <w:t xml:space="preserve">W = 0.87615, p-value = 0.001615</w:t>
+        <w:t xml:space="preserve">W = 0.91575, p-value = 0.04709</w:t>
       </w:r>
     </w:p>
     <w:bookmarkEnd w:id="47"/>
@@ -2048,13 +2036,7 @@
         <w:pStyle w:val="FirstParagraph"/>
       </w:pPr>
       <w:r>
-        <w:t xml:space="preserve">Let’s check these assumptions using the lion data from Example 17.1 Lion</w:t>
-      </w:r>
-      <w:r>
-        <w:t xml:space="preserve"> </w:t>
-      </w:r>
-      <w:r>
-        <w:t xml:space="preserve">Noses:</w:t>
+        <w:t xml:space="preserve">Let’s check these assumptions using the booby data</w:t>
       </w:r>
     </w:p>
     <w:bookmarkEnd w:id="48"/>
@@ -2106,7 +2088,7 @@
       </w:r>
     </w:p>
     <w:bookmarkEnd w:id="52"/>
-    <w:bookmarkStart w:id="54" w:name="lecture-9-correlation-analysis-5"/>
+    <w:bookmarkStart w:id="57" w:name="lecture-9-correlation-analysis-5"/>
     <w:p>
       <w:pPr>
         <w:pStyle w:val="Heading1"/>
@@ -2125,7 +2107,7 @@
         <w:t xml:space="preserve">Correlation Analysis</w:t>
       </w:r>
     </w:p>
-    <w:bookmarkStart w:id="53" w:name="what-to-do-if-assumptions-are-violated"/>
+    <w:bookmarkStart w:id="56" w:name="what-to-do-if-assumptions-are-violated"/>
     <w:p>
       <w:pPr>
         <w:pStyle w:val="Heading3"/>
@@ -2180,380 +2162,1317 @@
     </w:p>
     <w:p>
       <w:pPr>
-        <w:pStyle w:val="BodyText"/>
-      </w:pPr>
-      <w:r>
-        <w:t xml:space="preserve">To understand the amount of variation explained, you can square the</w:t>
-      </w:r>
-      <w:r>
-        <w:t xml:space="preserve"> </w:t>
-      </w:r>
-      <w:r>
-        <w:t xml:space="preserve">Spearman’s rho value.</w:t>
-      </w:r>
-    </w:p>
-    <w:p>
-      <w:pPr>
-        <w:pStyle w:val="BodyText"/>
-      </w:pPr>
-      <w:r>
-        <w:t xml:space="preserve">For your value of 0.74485:</w:t>
-      </w:r>
-    </w:p>
-    <w:p>
-      <w:pPr>
-        <w:pStyle w:val="BodyText"/>
-      </w:pPr>
-      <w:r>
-        <w:t xml:space="preserve">ρ² = 0.74485² = 0.5548</w:t>
-      </w:r>
-    </w:p>
-    <w:p>
-      <w:pPr>
-        <w:pStyle w:val="BodyText"/>
-      </w:pPr>
-      <w:r>
-        <w:t xml:space="preserve">This means approximately 55.48% of the variance in ranks of one variable</w:t>
-      </w:r>
-      <w:r>
-        <w:t xml:space="preserve"> </w:t>
-      </w:r>
-      <w:r>
-        <w:t xml:space="preserve">can be explained by the ranks of the other variable. This is similar to</w:t>
-      </w:r>
-      <w:r>
-        <w:t xml:space="preserve"> </w:t>
-      </w:r>
-      <w:r>
-        <w:t xml:space="preserve">how R² works in linear regression, but specifically for ranked data.</w:t>
-      </w:r>
-    </w:p>
-    <w:p>
-      <w:pPr>
         <w:pStyle w:val="SourceCode"/>
       </w:pPr>
       <w:r>
-        <w:br/>
-      </w:r>
-      <w:r>
-        <w:rPr>
-          <w:rStyle w:val="VerbatimChar"/>
-        </w:rPr>
-        <w:t xml:space="preserve">    Spearman's rank correlation rho</w:t>
-      </w:r>
-      <w:r>
-        <w:br/>
-      </w:r>
-      <w:r>
-        <w:br/>
-      </w:r>
-      <w:r>
-        <w:rPr>
-          <w:rStyle w:val="VerbatimChar"/>
-        </w:rPr>
-        <w:t xml:space="preserve">data:  lion_data$proportion_black and lion_data$age_years</w:t>
-      </w:r>
-      <w:r>
-        <w:br/>
-      </w:r>
-      <w:r>
-        <w:rPr>
-          <w:rStyle w:val="VerbatimChar"/>
-        </w:rPr>
-        <w:t xml:space="preserve">S = 1392.1, p-value = 1.013e-06</w:t>
-      </w:r>
-      <w:r>
-        <w:br/>
-      </w:r>
-      <w:r>
-        <w:rPr>
-          <w:rStyle w:val="VerbatimChar"/>
-        </w:rPr>
-        <w:t xml:space="preserve">alternative hypothesis: true rho is not equal to 0</w:t>
-      </w:r>
-      <w:r>
-        <w:br/>
-      </w:r>
-      <w:r>
-        <w:rPr>
-          <w:rStyle w:val="VerbatimChar"/>
-        </w:rPr>
-        <w:t xml:space="preserve">sample estimates:</w:t>
-      </w:r>
-      <w:r>
-        <w:br/>
-      </w:r>
-      <w:r>
-        <w:rPr>
-          <w:rStyle w:val="VerbatimChar"/>
-        </w:rPr>
-        <w:t xml:space="preserve">      rho </w:t>
-      </w:r>
-      <w:r>
-        <w:br/>
-      </w:r>
-      <w:r>
-        <w:rPr>
-          <w:rStyle w:val="VerbatimChar"/>
-        </w:rPr>
-        <w:t xml:space="preserve">0.7448561 </w:t>
-      </w:r>
-    </w:p>
-    <w:bookmarkEnd w:id="53"/>
-    <w:bookmarkEnd w:id="54"/>
-    <w:bookmarkStart w:id="59" w:name="lecture-9-correlation-analysis-6"/>
-    <w:p>
-      <w:pPr>
-        <w:pStyle w:val="Heading1"/>
-      </w:pPr>
-      <w:r>
-        <w:rPr>
-          <w:b/>
-          <w:bCs/>
-        </w:rPr>
-        <w:t xml:space="preserve">Lecture 9:</w:t>
-      </w:r>
-      <w:r>
-        <w:t xml:space="preserve"> </w:t>
-      </w:r>
-      <w:r>
-        <w:t xml:space="preserve">Correlation Analysis</w:t>
-      </w:r>
-    </w:p>
-    <w:bookmarkStart w:id="55" w:name="correlation-important-considerations"/>
-    <w:p>
-      <w:pPr>
-        <w:pStyle w:val="Heading3"/>
-      </w:pPr>
-      <w:r>
-        <w:t xml:space="preserve">Correlation: Important Considerations</w:t>
-      </w:r>
-    </w:p>
-    <w:p>
-      <w:pPr>
-        <w:pStyle w:val="FirstParagraph"/>
-      </w:pPr>
-      <w:r>
-        <w:rPr>
-          <w:b/>
-          <w:bCs/>
-        </w:rPr>
-        <w:t xml:space="preserve">The correlation coefficient depends on the range</w:t>
-      </w:r>
-    </w:p>
-    <w:p>
-      <w:pPr>
-        <w:pStyle w:val="Compact"/>
-        <w:numPr>
-          <w:ilvl w:val="0"/>
-          <w:numId w:val="1011"/>
-        </w:numPr>
-      </w:pPr>
-      <w:r>
-        <w:t xml:space="preserve">Restricting range of values can reduce the correlation coefficient</w:t>
-      </w:r>
-    </w:p>
-    <w:p>
-      <w:pPr>
-        <w:pStyle w:val="Compact"/>
-        <w:numPr>
-          <w:ilvl w:val="0"/>
-          <w:numId w:val="1011"/>
-        </w:numPr>
-      </w:pPr>
-      <w:r>
-        <w:t xml:space="preserve">Comparing correlations between studies requires similar ranges of</w:t>
-      </w:r>
-      <w:r>
-        <w:t xml:space="preserve"> </w:t>
-      </w:r>
-      <w:r>
-        <w:t xml:space="preserve">values</w:t>
-      </w:r>
-    </w:p>
-    <w:p>
-      <w:pPr>
-        <w:pStyle w:val="FirstParagraph"/>
-      </w:pPr>
-      <w:r>
-        <w:rPr>
-          <w:b/>
-          <w:bCs/>
-        </w:rPr>
-        <w:t xml:space="preserve">Measurement error affects correlation</w:t>
-      </w:r>
-    </w:p>
-    <w:p>
-      <w:pPr>
-        <w:pStyle w:val="Compact"/>
-        <w:numPr>
-          <w:ilvl w:val="0"/>
-          <w:numId w:val="1012"/>
-        </w:numPr>
-      </w:pPr>
-      <w:r>
-        <w:t xml:space="preserve">Measurement error in X or Y tends to weaken observed correlation</w:t>
-      </w:r>
-    </w:p>
-    <w:p>
-      <w:pPr>
-        <w:pStyle w:val="Compact"/>
-        <w:numPr>
-          <w:ilvl w:val="0"/>
-          <w:numId w:val="1012"/>
-        </w:numPr>
-      </w:pPr>
-      <w:r>
-        <w:t xml:space="preserve">This bias is called</w:t>
-      </w:r>
-      <w:r>
-        <w:t xml:space="preserve"> </w:t>
-      </w:r>
-      <w:r>
-        <w:rPr>
-          <w:b/>
-          <w:bCs/>
-        </w:rPr>
-        <w:t xml:space="preserve">attenuation</w:t>
-      </w:r>
-    </w:p>
-    <w:p>
-      <w:pPr>
-        <w:pStyle w:val="Compact"/>
-        <w:numPr>
-          <w:ilvl w:val="0"/>
-          <w:numId w:val="1012"/>
-        </w:numPr>
-      </w:pPr>
-      <w:r>
-        <w:t xml:space="preserve">True correlation typically stronger than observed correlation</w:t>
-      </w:r>
-    </w:p>
-    <w:p>
-      <w:pPr>
-        <w:pStyle w:val="FirstParagraph"/>
-      </w:pPr>
-      <w:r>
-        <w:rPr>
-          <w:b/>
-          <w:bCs/>
-        </w:rPr>
-        <w:t xml:space="preserve">Correlation vs. Causation</w:t>
-      </w:r>
-    </w:p>
-    <w:p>
-      <w:pPr>
-        <w:pStyle w:val="Compact"/>
-        <w:numPr>
-          <w:ilvl w:val="0"/>
-          <w:numId w:val="1013"/>
-        </w:numPr>
-      </w:pPr>
-      <w:r>
-        <w:t xml:space="preserve">Correlation does not imply causation</w:t>
-      </w:r>
-    </w:p>
-    <w:p>
-      <w:pPr>
-        <w:pStyle w:val="Compact"/>
-        <w:numPr>
-          <w:ilvl w:val="0"/>
-          <w:numId w:val="1013"/>
-        </w:numPr>
-      </w:pPr>
-      <w:r>
-        <w:t xml:space="preserve">Three possible explanations for correlation:</w:t>
-      </w:r>
-    </w:p>
-    <w:p>
-      <w:pPr>
-        <w:pStyle w:val="Compact"/>
-        <w:numPr>
-          <w:ilvl w:val="1"/>
-          <w:numId w:val="1014"/>
-        </w:numPr>
-      </w:pPr>
-      <w:r>
-        <w:t xml:space="preserve">X causes Y</w:t>
-      </w:r>
-    </w:p>
-    <w:p>
-      <w:pPr>
-        <w:pStyle w:val="Compact"/>
-        <w:numPr>
-          <w:ilvl w:val="1"/>
-          <w:numId w:val="1014"/>
-        </w:numPr>
-      </w:pPr>
-      <w:r>
-        <w:t xml:space="preserve">Y causes X</w:t>
-      </w:r>
-    </w:p>
-    <w:p>
-      <w:pPr>
-        <w:pStyle w:val="Compact"/>
-        <w:numPr>
-          <w:ilvl w:val="1"/>
-          <w:numId w:val="1014"/>
-        </w:numPr>
-      </w:pPr>
-      <w:r>
-        <w:t xml:space="preserve">Z (a third variable) causes both X and Y</w:t>
-      </w:r>
-    </w:p>
-    <w:p>
-      <w:pPr>
-        <w:pStyle w:val="FirstParagraph"/>
-      </w:pPr>
-      <w:r>
-        <w:rPr>
-          <w:b/>
-          <w:bCs/>
-        </w:rPr>
-        <w:t xml:space="preserve">Correlation significance test</w:t>
-      </w:r>
-    </w:p>
-    <w:p>
-      <w:pPr>
-        <w:pStyle w:val="Compact"/>
-        <w:numPr>
-          <w:ilvl w:val="0"/>
-          <w:numId w:val="1015"/>
-        </w:numPr>
-      </w:pPr>
-      <w:r>
-        <w:t xml:space="preserve">H₀: ρ = 0 (no correlation in population)</w:t>
-      </w:r>
-    </w:p>
-    <w:p>
-      <w:pPr>
-        <w:pStyle w:val="Compact"/>
-        <w:numPr>
-          <w:ilvl w:val="0"/>
-          <w:numId w:val="1015"/>
-        </w:numPr>
-      </w:pPr>
-      <w:r>
-        <w:t xml:space="preserve">H₁: ρ ≠ 0 (correlation exists in population)</w:t>
-      </w:r>
-    </w:p>
-    <w:p>
-      <w:pPr>
-        <w:pStyle w:val="Compact"/>
-        <w:numPr>
-          <w:ilvl w:val="0"/>
-          <w:numId w:val="1015"/>
-        </w:numPr>
-      </w:pPr>
-      <w:r>
-        <w:rPr>
-          <w:b/>
-          <w:bCs/>
-        </w:rPr>
-        <w:t xml:space="preserve">Test statistic: t = r / SE(r) with df = n-2</w:t>
-      </w:r>
-    </w:p>
-    <w:bookmarkEnd w:id="55"/>
+        <w:rPr>
+          <w:rStyle w:val="CommentTok"/>
+        </w:rPr>
+        <w:t xml:space="preserve">#| echo: false</w:t>
+      </w:r>
+      <w:r>
+        <w:br/>
+      </w:r>
+      <w:r>
+        <w:rPr>
+          <w:rStyle w:val="CommentTok"/>
+        </w:rPr>
+        <w:t xml:space="preserve">#| fig-height: 5</w:t>
+      </w:r>
+      <w:r>
+        <w:br/>
+      </w:r>
+      <w:r>
+        <w:rPr>
+          <w:rStyle w:val="CommentTok"/>
+        </w:rPr>
+        <w:t xml:space="preserve">#| fig-width: 5</w:t>
+      </w:r>
+      <w:r>
+        <w:br/>
+      </w:r>
+      <w:r>
+        <w:rPr>
+          <w:rStyle w:val="CommentTok"/>
+        </w:rPr>
+        <w:t xml:space="preserve">#| message: false</w:t>
+      </w:r>
+      <w:r>
+        <w:br/>
+      </w:r>
+      <w:r>
+        <w:rPr>
+          <w:rStyle w:val="CommentTok"/>
+        </w:rPr>
+        <w:t xml:space="preserve">#| warning: false</w:t>
+      </w:r>
+      <w:r>
+        <w:br/>
+      </w:r>
+      <w:r>
+        <w:br/>
+      </w:r>
+      <w:r>
+        <w:br/>
+      </w:r>
+      <w:r>
+        <w:rPr>
+          <w:rStyle w:val="NormalTok"/>
+        </w:rPr>
+        <w:t xml:space="preserve">p1_lion </w:t>
+      </w:r>
+      <w:r>
+        <w:rPr>
+          <w:rStyle w:val="OtherTok"/>
+        </w:rPr>
+        <w:t xml:space="preserve">&lt;-</w:t>
+      </w:r>
+      <w:r>
+        <w:rPr>
+          <w:rStyle w:val="NormalTok"/>
+        </w:rPr>
+        <w:t xml:space="preserve"> </w:t>
+      </w:r>
+      <w:r>
+        <w:rPr>
+          <w:rStyle w:val="FunctionTok"/>
+        </w:rPr>
+        <w:t xml:space="preserve">ggplot</w:t>
+      </w:r>
+      <w:r>
+        <w:rPr>
+          <w:rStyle w:val="NormalTok"/>
+        </w:rPr>
+        <w:t xml:space="preserve">(lion_data, </w:t>
+      </w:r>
+      <w:r>
+        <w:rPr>
+          <w:rStyle w:val="FunctionTok"/>
+        </w:rPr>
+        <w:t xml:space="preserve">aes</w:t>
+      </w:r>
+      <w:r>
+        <w:rPr>
+          <w:rStyle w:val="NormalTok"/>
+        </w:rPr>
+        <w:t xml:space="preserve">(</w:t>
+      </w:r>
+      <w:r>
+        <w:rPr>
+          <w:rStyle w:val="AttributeTok"/>
+        </w:rPr>
+        <w:t xml:space="preserve">x =</w:t>
+      </w:r>
+      <w:r>
+        <w:rPr>
+          <w:rStyle w:val="NormalTok"/>
+        </w:rPr>
+        <w:t xml:space="preserve"> proportion_black)) </w:t>
+      </w:r>
+      <w:r>
+        <w:rPr>
+          <w:rStyle w:val="SpecialCharTok"/>
+        </w:rPr>
+        <w:t xml:space="preserve">+</w:t>
+      </w:r>
+      <w:r>
+        <w:br/>
+      </w:r>
+      <w:r>
+        <w:rPr>
+          <w:rStyle w:val="NormalTok"/>
+        </w:rPr>
+        <w:t xml:space="preserve">  </w:t>
+      </w:r>
+      <w:r>
+        <w:rPr>
+          <w:rStyle w:val="FunctionTok"/>
+        </w:rPr>
+        <w:t xml:space="preserve">geom_histogram</w:t>
+      </w:r>
+      <w:r>
+        <w:rPr>
+          <w:rStyle w:val="NormalTok"/>
+        </w:rPr>
+        <w:t xml:space="preserve">(</w:t>
+      </w:r>
+      <w:r>
+        <w:rPr>
+          <w:rStyle w:val="AttributeTok"/>
+        </w:rPr>
+        <w:t xml:space="preserve">bins =</w:t>
+      </w:r>
+      <w:r>
+        <w:rPr>
+          <w:rStyle w:val="NormalTok"/>
+        </w:rPr>
+        <w:t xml:space="preserve"> </w:t>
+      </w:r>
+      <w:r>
+        <w:rPr>
+          <w:rStyle w:val="DecValTok"/>
+        </w:rPr>
+        <w:t xml:space="preserve">10</w:t>
+      </w:r>
+      <w:r>
+        <w:rPr>
+          <w:rStyle w:val="NormalTok"/>
+        </w:rPr>
+        <w:t xml:space="preserve">, </w:t>
+      </w:r>
+      <w:r>
+        <w:rPr>
+          <w:rStyle w:val="AttributeTok"/>
+        </w:rPr>
+        <w:t xml:space="preserve">fill =</w:t>
+      </w:r>
+      <w:r>
+        <w:rPr>
+          <w:rStyle w:val="NormalTok"/>
+        </w:rPr>
+        <w:t xml:space="preserve"> </w:t>
+      </w:r>
+      <w:r>
+        <w:rPr>
+          <w:rStyle w:val="StringTok"/>
+        </w:rPr>
+        <w:t xml:space="preserve">"lightblue"</w:t>
+      </w:r>
+      <w:r>
+        <w:rPr>
+          <w:rStyle w:val="NormalTok"/>
+        </w:rPr>
+        <w:t xml:space="preserve">, </w:t>
+      </w:r>
+      <w:r>
+        <w:rPr>
+          <w:rStyle w:val="AttributeTok"/>
+        </w:rPr>
+        <w:t xml:space="preserve">color =</w:t>
+      </w:r>
+      <w:r>
+        <w:rPr>
+          <w:rStyle w:val="NormalTok"/>
+        </w:rPr>
+        <w:t xml:space="preserve"> </w:t>
+      </w:r>
+      <w:r>
+        <w:rPr>
+          <w:rStyle w:val="StringTok"/>
+        </w:rPr>
+        <w:t xml:space="preserve">"black"</w:t>
+      </w:r>
+      <w:r>
+        <w:rPr>
+          <w:rStyle w:val="NormalTok"/>
+        </w:rPr>
+        <w:t xml:space="preserve">) </w:t>
+      </w:r>
+      <w:r>
+        <w:rPr>
+          <w:rStyle w:val="SpecialCharTok"/>
+        </w:rPr>
+        <w:t xml:space="preserve">+</w:t>
+      </w:r>
+      <w:r>
+        <w:br/>
+      </w:r>
+      <w:r>
+        <w:rPr>
+          <w:rStyle w:val="NormalTok"/>
+        </w:rPr>
+        <w:t xml:space="preserve">  </w:t>
+      </w:r>
+      <w:r>
+        <w:rPr>
+          <w:rStyle w:val="FunctionTok"/>
+        </w:rPr>
+        <w:t xml:space="preserve">labs</w:t>
+      </w:r>
+      <w:r>
+        <w:rPr>
+          <w:rStyle w:val="NormalTok"/>
+        </w:rPr>
+        <w:t xml:space="preserve">(</w:t>
+      </w:r>
+      <w:r>
+        <w:rPr>
+          <w:rStyle w:val="AttributeTok"/>
+        </w:rPr>
+        <w:t xml:space="preserve">title =</w:t>
+      </w:r>
+      <w:r>
+        <w:rPr>
+          <w:rStyle w:val="NormalTok"/>
+        </w:rPr>
+        <w:t xml:space="preserve"> </w:t>
+      </w:r>
+      <w:r>
+        <w:rPr>
+          <w:rStyle w:val="StringTok"/>
+        </w:rPr>
+        <w:t xml:space="preserve">"Prop black"</w:t>
+      </w:r>
+      <w:r>
+        <w:rPr>
+          <w:rStyle w:val="NormalTok"/>
+        </w:rPr>
+        <w:t xml:space="preserve">,</w:t>
+      </w:r>
+      <w:r>
+        <w:br/>
+      </w:r>
+      <w:r>
+        <w:rPr>
+          <w:rStyle w:val="NormalTok"/>
+        </w:rPr>
+        <w:t xml:space="preserve">       </w:t>
+      </w:r>
+      <w:r>
+        <w:rPr>
+          <w:rStyle w:val="AttributeTok"/>
+        </w:rPr>
+        <w:t xml:space="preserve">x =</w:t>
+      </w:r>
+      <w:r>
+        <w:rPr>
+          <w:rStyle w:val="NormalTok"/>
+        </w:rPr>
+        <w:t xml:space="preserve"> </w:t>
+      </w:r>
+      <w:r>
+        <w:rPr>
+          <w:rStyle w:val="StringTok"/>
+        </w:rPr>
+        <w:t xml:space="preserve">"Visits"</w:t>
+      </w:r>
+      <w:r>
+        <w:rPr>
+          <w:rStyle w:val="NormalTok"/>
+        </w:rPr>
+        <w:t xml:space="preserve">,</w:t>
+      </w:r>
+      <w:r>
+        <w:br/>
+      </w:r>
+      <w:r>
+        <w:rPr>
+          <w:rStyle w:val="NormalTok"/>
+        </w:rPr>
+        <w:t xml:space="preserve">       </w:t>
+      </w:r>
+      <w:r>
+        <w:rPr>
+          <w:rStyle w:val="AttributeTok"/>
+        </w:rPr>
+        <w:t xml:space="preserve">y =</w:t>
+      </w:r>
+      <w:r>
+        <w:rPr>
+          <w:rStyle w:val="NormalTok"/>
+        </w:rPr>
+        <w:t xml:space="preserve"> </w:t>
+      </w:r>
+      <w:r>
+        <w:rPr>
+          <w:rStyle w:val="StringTok"/>
+        </w:rPr>
+        <w:t xml:space="preserve">"Frequency"</w:t>
+      </w:r>
+      <w:r>
+        <w:rPr>
+          <w:rStyle w:val="NormalTok"/>
+        </w:rPr>
+        <w:t xml:space="preserve">) </w:t>
+      </w:r>
+      <w:r>
+        <w:rPr>
+          <w:rStyle w:val="SpecialCharTok"/>
+        </w:rPr>
+        <w:t xml:space="preserve">+</w:t>
+      </w:r>
+      <w:r>
+        <w:br/>
+      </w:r>
+      <w:r>
+        <w:rPr>
+          <w:rStyle w:val="NormalTok"/>
+        </w:rPr>
+        <w:t xml:space="preserve">  </w:t>
+      </w:r>
+      <w:r>
+        <w:rPr>
+          <w:rStyle w:val="FunctionTok"/>
+        </w:rPr>
+        <w:t xml:space="preserve">theme_minimal</w:t>
+      </w:r>
+      <w:r>
+        <w:rPr>
+          <w:rStyle w:val="NormalTok"/>
+        </w:rPr>
+        <w:t xml:space="preserve">()</w:t>
+      </w:r>
+      <w:r>
+        <w:br/>
+      </w:r>
+      <w:r>
+        <w:br/>
+      </w:r>
+      <w:r>
+        <w:rPr>
+          <w:rStyle w:val="NormalTok"/>
+        </w:rPr>
+        <w:t xml:space="preserve">p2_lion </w:t>
+      </w:r>
+      <w:r>
+        <w:rPr>
+          <w:rStyle w:val="OtherTok"/>
+        </w:rPr>
+        <w:t xml:space="preserve">&lt;-</w:t>
+      </w:r>
+      <w:r>
+        <w:rPr>
+          <w:rStyle w:val="NormalTok"/>
+        </w:rPr>
+        <w:t xml:space="preserve"> </w:t>
+      </w:r>
+      <w:r>
+        <w:rPr>
+          <w:rStyle w:val="FunctionTok"/>
+        </w:rPr>
+        <w:t xml:space="preserve">ggplot</w:t>
+      </w:r>
+      <w:r>
+        <w:rPr>
+          <w:rStyle w:val="NormalTok"/>
+        </w:rPr>
+        <w:t xml:space="preserve">(lion_data, </w:t>
+      </w:r>
+      <w:r>
+        <w:rPr>
+          <w:rStyle w:val="FunctionTok"/>
+        </w:rPr>
+        <w:t xml:space="preserve">aes</w:t>
+      </w:r>
+      <w:r>
+        <w:rPr>
+          <w:rStyle w:val="NormalTok"/>
+        </w:rPr>
+        <w:t xml:space="preserve">(</w:t>
+      </w:r>
+      <w:r>
+        <w:rPr>
+          <w:rStyle w:val="AttributeTok"/>
+        </w:rPr>
+        <w:t xml:space="preserve">x =</w:t>
+      </w:r>
+      <w:r>
+        <w:rPr>
+          <w:rStyle w:val="NormalTok"/>
+        </w:rPr>
+        <w:t xml:space="preserve"> age_years)) </w:t>
+      </w:r>
+      <w:r>
+        <w:rPr>
+          <w:rStyle w:val="SpecialCharTok"/>
+        </w:rPr>
+        <w:t xml:space="preserve">+</w:t>
+      </w:r>
+      <w:r>
+        <w:br/>
+      </w:r>
+      <w:r>
+        <w:rPr>
+          <w:rStyle w:val="NormalTok"/>
+        </w:rPr>
+        <w:t xml:space="preserve">  </w:t>
+      </w:r>
+      <w:r>
+        <w:rPr>
+          <w:rStyle w:val="FunctionTok"/>
+        </w:rPr>
+        <w:t xml:space="preserve">geom_histogram</w:t>
+      </w:r>
+      <w:r>
+        <w:rPr>
+          <w:rStyle w:val="NormalTok"/>
+        </w:rPr>
+        <w:t xml:space="preserve">(</w:t>
+      </w:r>
+      <w:r>
+        <w:rPr>
+          <w:rStyle w:val="AttributeTok"/>
+        </w:rPr>
+        <w:t xml:space="preserve">bins =</w:t>
+      </w:r>
+      <w:r>
+        <w:rPr>
+          <w:rStyle w:val="NormalTok"/>
+        </w:rPr>
+        <w:t xml:space="preserve"> </w:t>
+      </w:r>
+      <w:r>
+        <w:rPr>
+          <w:rStyle w:val="DecValTok"/>
+        </w:rPr>
+        <w:t xml:space="preserve">10</w:t>
+      </w:r>
+      <w:r>
+        <w:rPr>
+          <w:rStyle w:val="NormalTok"/>
+        </w:rPr>
+        <w:t xml:space="preserve">, </w:t>
+      </w:r>
+      <w:r>
+        <w:rPr>
+          <w:rStyle w:val="AttributeTok"/>
+        </w:rPr>
+        <w:t xml:space="preserve">fill =</w:t>
+      </w:r>
+      <w:r>
+        <w:rPr>
+          <w:rStyle w:val="NormalTok"/>
+        </w:rPr>
+        <w:t xml:space="preserve"> </w:t>
+      </w:r>
+      <w:r>
+        <w:rPr>
+          <w:rStyle w:val="StringTok"/>
+        </w:rPr>
+        <w:t xml:space="preserve">"lightgreen"</w:t>
+      </w:r>
+      <w:r>
+        <w:rPr>
+          <w:rStyle w:val="NormalTok"/>
+        </w:rPr>
+        <w:t xml:space="preserve">, </w:t>
+      </w:r>
+      <w:r>
+        <w:rPr>
+          <w:rStyle w:val="AttributeTok"/>
+        </w:rPr>
+        <w:t xml:space="preserve">color =</w:t>
+      </w:r>
+      <w:r>
+        <w:rPr>
+          <w:rStyle w:val="NormalTok"/>
+        </w:rPr>
+        <w:t xml:space="preserve"> </w:t>
+      </w:r>
+      <w:r>
+        <w:rPr>
+          <w:rStyle w:val="StringTok"/>
+        </w:rPr>
+        <w:t xml:space="preserve">"black"</w:t>
+      </w:r>
+      <w:r>
+        <w:rPr>
+          <w:rStyle w:val="NormalTok"/>
+        </w:rPr>
+        <w:t xml:space="preserve">) </w:t>
+      </w:r>
+      <w:r>
+        <w:rPr>
+          <w:rStyle w:val="SpecialCharTok"/>
+        </w:rPr>
+        <w:t xml:space="preserve">+</w:t>
+      </w:r>
+      <w:r>
+        <w:br/>
+      </w:r>
+      <w:r>
+        <w:rPr>
+          <w:rStyle w:val="NormalTok"/>
+        </w:rPr>
+        <w:t xml:space="preserve">  </w:t>
+      </w:r>
+      <w:r>
+        <w:rPr>
+          <w:rStyle w:val="FunctionTok"/>
+        </w:rPr>
+        <w:t xml:space="preserve">labs</w:t>
+      </w:r>
+      <w:r>
+        <w:rPr>
+          <w:rStyle w:val="NormalTok"/>
+        </w:rPr>
+        <w:t xml:space="preserve">(</w:t>
+      </w:r>
+      <w:r>
+        <w:rPr>
+          <w:rStyle w:val="AttributeTok"/>
+        </w:rPr>
+        <w:t xml:space="preserve">title =</w:t>
+      </w:r>
+      <w:r>
+        <w:rPr>
+          <w:rStyle w:val="NormalTok"/>
+        </w:rPr>
+        <w:t xml:space="preserve"> </w:t>
+      </w:r>
+      <w:r>
+        <w:rPr>
+          <w:rStyle w:val="StringTok"/>
+        </w:rPr>
+        <w:t xml:space="preserve">"Age"</w:t>
+      </w:r>
+      <w:r>
+        <w:rPr>
+          <w:rStyle w:val="NormalTok"/>
+        </w:rPr>
+        <w:t xml:space="preserve">,</w:t>
+      </w:r>
+      <w:r>
+        <w:br/>
+      </w:r>
+      <w:r>
+        <w:rPr>
+          <w:rStyle w:val="NormalTok"/>
+        </w:rPr>
+        <w:t xml:space="preserve">       </w:t>
+      </w:r>
+      <w:r>
+        <w:rPr>
+          <w:rStyle w:val="AttributeTok"/>
+        </w:rPr>
+        <w:t xml:space="preserve">x =</w:t>
+      </w:r>
+      <w:r>
+        <w:rPr>
+          <w:rStyle w:val="NormalTok"/>
+        </w:rPr>
+        <w:t xml:space="preserve"> </w:t>
+      </w:r>
+      <w:r>
+        <w:rPr>
+          <w:rStyle w:val="StringTok"/>
+        </w:rPr>
+        <w:t xml:space="preserve">"Age"</w:t>
+      </w:r>
+      <w:r>
+        <w:rPr>
+          <w:rStyle w:val="NormalTok"/>
+        </w:rPr>
+        <w:t xml:space="preserve">,</w:t>
+      </w:r>
+      <w:r>
+        <w:br/>
+      </w:r>
+      <w:r>
+        <w:rPr>
+          <w:rStyle w:val="NormalTok"/>
+        </w:rPr>
+        <w:t xml:space="preserve">       </w:t>
+      </w:r>
+      <w:r>
+        <w:rPr>
+          <w:rStyle w:val="AttributeTok"/>
+        </w:rPr>
+        <w:t xml:space="preserve">y =</w:t>
+      </w:r>
+      <w:r>
+        <w:rPr>
+          <w:rStyle w:val="NormalTok"/>
+        </w:rPr>
+        <w:t xml:space="preserve"> </w:t>
+      </w:r>
+      <w:r>
+        <w:rPr>
+          <w:rStyle w:val="StringTok"/>
+        </w:rPr>
+        <w:t xml:space="preserve">"Frequency"</w:t>
+      </w:r>
+      <w:r>
+        <w:rPr>
+          <w:rStyle w:val="NormalTok"/>
+        </w:rPr>
+        <w:t xml:space="preserve">) </w:t>
+      </w:r>
+      <w:r>
+        <w:rPr>
+          <w:rStyle w:val="SpecialCharTok"/>
+        </w:rPr>
+        <w:t xml:space="preserve">+</w:t>
+      </w:r>
+      <w:r>
+        <w:br/>
+      </w:r>
+      <w:r>
+        <w:rPr>
+          <w:rStyle w:val="NormalTok"/>
+        </w:rPr>
+        <w:t xml:space="preserve">  </w:t>
+      </w:r>
+      <w:r>
+        <w:rPr>
+          <w:rStyle w:val="FunctionTok"/>
+        </w:rPr>
+        <w:t xml:space="preserve">theme_minimal</w:t>
+      </w:r>
+      <w:r>
+        <w:rPr>
+          <w:rStyle w:val="NormalTok"/>
+        </w:rPr>
+        <w:t xml:space="preserve">()</w:t>
+      </w:r>
+      <w:r>
+        <w:br/>
+      </w:r>
+      <w:r>
+        <w:br/>
+      </w:r>
+      <w:r>
+        <w:rPr>
+          <w:rStyle w:val="NormalTok"/>
+        </w:rPr>
+        <w:t xml:space="preserve">p3_lion </w:t>
+      </w:r>
+      <w:r>
+        <w:rPr>
+          <w:rStyle w:val="OtherTok"/>
+        </w:rPr>
+        <w:t xml:space="preserve">&lt;-</w:t>
+      </w:r>
+      <w:r>
+        <w:rPr>
+          <w:rStyle w:val="NormalTok"/>
+        </w:rPr>
+        <w:t xml:space="preserve"> </w:t>
+      </w:r>
+      <w:r>
+        <w:rPr>
+          <w:rStyle w:val="FunctionTok"/>
+        </w:rPr>
+        <w:t xml:space="preserve">ggplot</w:t>
+      </w:r>
+      <w:r>
+        <w:rPr>
+          <w:rStyle w:val="NormalTok"/>
+        </w:rPr>
+        <w:t xml:space="preserve">(lion_data, </w:t>
+      </w:r>
+      <w:r>
+        <w:rPr>
+          <w:rStyle w:val="FunctionTok"/>
+        </w:rPr>
+        <w:t xml:space="preserve">aes</w:t>
+      </w:r>
+      <w:r>
+        <w:rPr>
+          <w:rStyle w:val="NormalTok"/>
+        </w:rPr>
+        <w:t xml:space="preserve">(</w:t>
+      </w:r>
+      <w:r>
+        <w:rPr>
+          <w:rStyle w:val="AttributeTok"/>
+        </w:rPr>
+        <w:t xml:space="preserve">sample =</w:t>
+      </w:r>
+      <w:r>
+        <w:rPr>
+          <w:rStyle w:val="NormalTok"/>
+        </w:rPr>
+        <w:t xml:space="preserve"> proportion_black)) </w:t>
+      </w:r>
+      <w:r>
+        <w:rPr>
+          <w:rStyle w:val="SpecialCharTok"/>
+        </w:rPr>
+        <w:t xml:space="preserve">+</w:t>
+      </w:r>
+      <w:r>
+        <w:br/>
+      </w:r>
+      <w:r>
+        <w:rPr>
+          <w:rStyle w:val="NormalTok"/>
+        </w:rPr>
+        <w:t xml:space="preserve">  </w:t>
+      </w:r>
+      <w:r>
+        <w:rPr>
+          <w:rStyle w:val="FunctionTok"/>
+        </w:rPr>
+        <w:t xml:space="preserve">geom_qq</w:t>
+      </w:r>
+      <w:r>
+        <w:rPr>
+          <w:rStyle w:val="NormalTok"/>
+        </w:rPr>
+        <w:t xml:space="preserve">() </w:t>
+      </w:r>
+      <w:r>
+        <w:rPr>
+          <w:rStyle w:val="SpecialCharTok"/>
+        </w:rPr>
+        <w:t xml:space="preserve">+</w:t>
+      </w:r>
+      <w:r>
+        <w:br/>
+      </w:r>
+      <w:r>
+        <w:rPr>
+          <w:rStyle w:val="NormalTok"/>
+        </w:rPr>
+        <w:t xml:space="preserve">  </w:t>
+      </w:r>
+      <w:r>
+        <w:rPr>
+          <w:rStyle w:val="FunctionTok"/>
+        </w:rPr>
+        <w:t xml:space="preserve">geom_qq_line</w:t>
+      </w:r>
+      <w:r>
+        <w:rPr>
+          <w:rStyle w:val="NormalTok"/>
+        </w:rPr>
+        <w:t xml:space="preserve">() </w:t>
+      </w:r>
+      <w:r>
+        <w:rPr>
+          <w:rStyle w:val="SpecialCharTok"/>
+        </w:rPr>
+        <w:t xml:space="preserve">+</w:t>
+      </w:r>
+      <w:r>
+        <w:br/>
+      </w:r>
+      <w:r>
+        <w:rPr>
+          <w:rStyle w:val="NormalTok"/>
+        </w:rPr>
+        <w:t xml:space="preserve">  </w:t>
+      </w:r>
+      <w:r>
+        <w:rPr>
+          <w:rStyle w:val="FunctionTok"/>
+        </w:rPr>
+        <w:t xml:space="preserve">labs</w:t>
+      </w:r>
+      <w:r>
+        <w:rPr>
+          <w:rStyle w:val="NormalTok"/>
+        </w:rPr>
+        <w:t xml:space="preserve">(</w:t>
+      </w:r>
+      <w:r>
+        <w:rPr>
+          <w:rStyle w:val="AttributeTok"/>
+        </w:rPr>
+        <w:t xml:space="preserve">title =</w:t>
+      </w:r>
+      <w:r>
+        <w:rPr>
+          <w:rStyle w:val="NormalTok"/>
+        </w:rPr>
+        <w:t xml:space="preserve"> </w:t>
+      </w:r>
+      <w:r>
+        <w:rPr>
+          <w:rStyle w:val="StringTok"/>
+        </w:rPr>
+        <w:t xml:space="preserve">"Q-Q Plot Prop Black"</w:t>
+      </w:r>
+      <w:r>
+        <w:rPr>
+          <w:rStyle w:val="NormalTok"/>
+        </w:rPr>
+        <w:t xml:space="preserve">,</w:t>
+      </w:r>
+      <w:r>
+        <w:br/>
+      </w:r>
+      <w:r>
+        <w:rPr>
+          <w:rStyle w:val="NormalTok"/>
+        </w:rPr>
+        <w:t xml:space="preserve">       </w:t>
+      </w:r>
+      <w:r>
+        <w:rPr>
+          <w:rStyle w:val="AttributeTok"/>
+        </w:rPr>
+        <w:t xml:space="preserve">x =</w:t>
+      </w:r>
+      <w:r>
+        <w:rPr>
+          <w:rStyle w:val="NormalTok"/>
+        </w:rPr>
+        <w:t xml:space="preserve"> </w:t>
+      </w:r>
+      <w:r>
+        <w:rPr>
+          <w:rStyle w:val="StringTok"/>
+        </w:rPr>
+        <w:t xml:space="preserve">"Theoretical Quantiles"</w:t>
+      </w:r>
+      <w:r>
+        <w:rPr>
+          <w:rStyle w:val="NormalTok"/>
+        </w:rPr>
+        <w:t xml:space="preserve">,</w:t>
+      </w:r>
+      <w:r>
+        <w:br/>
+      </w:r>
+      <w:r>
+        <w:rPr>
+          <w:rStyle w:val="NormalTok"/>
+        </w:rPr>
+        <w:t xml:space="preserve">       </w:t>
+      </w:r>
+      <w:r>
+        <w:rPr>
+          <w:rStyle w:val="AttributeTok"/>
+        </w:rPr>
+        <w:t xml:space="preserve">y =</w:t>
+      </w:r>
+      <w:r>
+        <w:rPr>
+          <w:rStyle w:val="NormalTok"/>
+        </w:rPr>
+        <w:t xml:space="preserve"> </w:t>
+      </w:r>
+      <w:r>
+        <w:rPr>
+          <w:rStyle w:val="StringTok"/>
+        </w:rPr>
+        <w:t xml:space="preserve">"Sample Quantiles"</w:t>
+      </w:r>
+      <w:r>
+        <w:rPr>
+          <w:rStyle w:val="NormalTok"/>
+        </w:rPr>
+        <w:t xml:space="preserve">) </w:t>
+      </w:r>
+      <w:r>
+        <w:rPr>
+          <w:rStyle w:val="SpecialCharTok"/>
+        </w:rPr>
+        <w:t xml:space="preserve">+</w:t>
+      </w:r>
+      <w:r>
+        <w:br/>
+      </w:r>
+      <w:r>
+        <w:rPr>
+          <w:rStyle w:val="NormalTok"/>
+        </w:rPr>
+        <w:t xml:space="preserve">  </w:t>
+      </w:r>
+      <w:r>
+        <w:rPr>
+          <w:rStyle w:val="FunctionTok"/>
+        </w:rPr>
+        <w:t xml:space="preserve">theme_minimal</w:t>
+      </w:r>
+      <w:r>
+        <w:rPr>
+          <w:rStyle w:val="NormalTok"/>
+        </w:rPr>
+        <w:t xml:space="preserve">()</w:t>
+      </w:r>
+      <w:r>
+        <w:rPr>
+          <w:rStyle w:val="SpecialCharTok"/>
+        </w:rPr>
+        <w:t xml:space="preserve">+</w:t>
+      </w:r>
+      <w:r>
+        <w:rPr>
+          <w:rStyle w:val="FunctionTok"/>
+        </w:rPr>
+        <w:t xml:space="preserve">theme</w:t>
+      </w:r>
+      <w:r>
+        <w:rPr>
+          <w:rStyle w:val="NormalTok"/>
+        </w:rPr>
+        <w:t xml:space="preserve">(</w:t>
+      </w:r>
+      <w:r>
+        <w:br/>
+      </w:r>
+      <w:r>
+        <w:rPr>
+          <w:rStyle w:val="NormalTok"/>
+        </w:rPr>
+        <w:t xml:space="preserve">    </w:t>
+      </w:r>
+      <w:r>
+        <w:rPr>
+          <w:rStyle w:val="AttributeTok"/>
+        </w:rPr>
+        <w:t xml:space="preserve">axis.title.x =</w:t>
+      </w:r>
+      <w:r>
+        <w:rPr>
+          <w:rStyle w:val="NormalTok"/>
+        </w:rPr>
+        <w:t xml:space="preserve"> </w:t>
+      </w:r>
+      <w:r>
+        <w:rPr>
+          <w:rStyle w:val="FunctionTok"/>
+        </w:rPr>
+        <w:t xml:space="preserve">element_blank</w:t>
+      </w:r>
+      <w:r>
+        <w:rPr>
+          <w:rStyle w:val="NormalTok"/>
+        </w:rPr>
+        <w:t xml:space="preserve">(),</w:t>
+      </w:r>
+      <w:r>
+        <w:br/>
+      </w:r>
+      <w:r>
+        <w:rPr>
+          <w:rStyle w:val="NormalTok"/>
+        </w:rPr>
+        <w:t xml:space="preserve">    </w:t>
+      </w:r>
+      <w:r>
+        <w:rPr>
+          <w:rStyle w:val="AttributeTok"/>
+        </w:rPr>
+        <w:t xml:space="preserve">axis.text.x =</w:t>
+      </w:r>
+      <w:r>
+        <w:rPr>
+          <w:rStyle w:val="NormalTok"/>
+        </w:rPr>
+        <w:t xml:space="preserve"> </w:t>
+      </w:r>
+      <w:r>
+        <w:rPr>
+          <w:rStyle w:val="FunctionTok"/>
+        </w:rPr>
+        <w:t xml:space="preserve">element_blank</w:t>
+      </w:r>
+      <w:r>
+        <w:rPr>
+          <w:rStyle w:val="NormalTok"/>
+        </w:rPr>
+        <w:t xml:space="preserve">())</w:t>
+      </w:r>
+      <w:r>
+        <w:br/>
+      </w:r>
+      <w:r>
+        <w:br/>
+      </w:r>
+      <w:r>
+        <w:rPr>
+          <w:rStyle w:val="NormalTok"/>
+        </w:rPr>
+        <w:t xml:space="preserve">p4_lion </w:t>
+      </w:r>
+      <w:r>
+        <w:rPr>
+          <w:rStyle w:val="OtherTok"/>
+        </w:rPr>
+        <w:t xml:space="preserve">&lt;-</w:t>
+      </w:r>
+      <w:r>
+        <w:rPr>
+          <w:rStyle w:val="NormalTok"/>
+        </w:rPr>
+        <w:t xml:space="preserve"> </w:t>
+      </w:r>
+      <w:r>
+        <w:rPr>
+          <w:rStyle w:val="FunctionTok"/>
+        </w:rPr>
+        <w:t xml:space="preserve">ggplot</w:t>
+      </w:r>
+      <w:r>
+        <w:rPr>
+          <w:rStyle w:val="NormalTok"/>
+        </w:rPr>
+        <w:t xml:space="preserve">(lion_data, </w:t>
+      </w:r>
+      <w:r>
+        <w:rPr>
+          <w:rStyle w:val="FunctionTok"/>
+        </w:rPr>
+        <w:t xml:space="preserve">aes</w:t>
+      </w:r>
+      <w:r>
+        <w:rPr>
+          <w:rStyle w:val="NormalTok"/>
+        </w:rPr>
+        <w:t xml:space="preserve">(</w:t>
+      </w:r>
+      <w:r>
+        <w:rPr>
+          <w:rStyle w:val="AttributeTok"/>
+        </w:rPr>
+        <w:t xml:space="preserve">sample =</w:t>
+      </w:r>
+      <w:r>
+        <w:rPr>
+          <w:rStyle w:val="NormalTok"/>
+        </w:rPr>
+        <w:t xml:space="preserve"> age_years)) </w:t>
+      </w:r>
+      <w:r>
+        <w:rPr>
+          <w:rStyle w:val="SpecialCharTok"/>
+        </w:rPr>
+        <w:t xml:space="preserve">+</w:t>
+      </w:r>
+      <w:r>
+        <w:br/>
+      </w:r>
+      <w:r>
+        <w:rPr>
+          <w:rStyle w:val="NormalTok"/>
+        </w:rPr>
+        <w:t xml:space="preserve">  </w:t>
+      </w:r>
+      <w:r>
+        <w:rPr>
+          <w:rStyle w:val="FunctionTok"/>
+        </w:rPr>
+        <w:t xml:space="preserve">geom_qq</w:t>
+      </w:r>
+      <w:r>
+        <w:rPr>
+          <w:rStyle w:val="NormalTok"/>
+        </w:rPr>
+        <w:t xml:space="preserve">() </w:t>
+      </w:r>
+      <w:r>
+        <w:rPr>
+          <w:rStyle w:val="SpecialCharTok"/>
+        </w:rPr>
+        <w:t xml:space="preserve">+</w:t>
+      </w:r>
+      <w:r>
+        <w:br/>
+      </w:r>
+      <w:r>
+        <w:rPr>
+          <w:rStyle w:val="NormalTok"/>
+        </w:rPr>
+        <w:t xml:space="preserve">  </w:t>
+      </w:r>
+      <w:r>
+        <w:rPr>
+          <w:rStyle w:val="FunctionTok"/>
+        </w:rPr>
+        <w:t xml:space="preserve">geom_qq_line</w:t>
+      </w:r>
+      <w:r>
+        <w:rPr>
+          <w:rStyle w:val="NormalTok"/>
+        </w:rPr>
+        <w:t xml:space="preserve">() </w:t>
+      </w:r>
+      <w:r>
+        <w:rPr>
+          <w:rStyle w:val="SpecialCharTok"/>
+        </w:rPr>
+        <w:t xml:space="preserve">+</w:t>
+      </w:r>
+      <w:r>
+        <w:br/>
+      </w:r>
+      <w:r>
+        <w:rPr>
+          <w:rStyle w:val="NormalTok"/>
+        </w:rPr>
+        <w:t xml:space="preserve">  </w:t>
+      </w:r>
+      <w:r>
+        <w:rPr>
+          <w:rStyle w:val="FunctionTok"/>
+        </w:rPr>
+        <w:t xml:space="preserve">labs</w:t>
+      </w:r>
+      <w:r>
+        <w:rPr>
+          <w:rStyle w:val="NormalTok"/>
+        </w:rPr>
+        <w:t xml:space="preserve">(</w:t>
+      </w:r>
+      <w:r>
+        <w:rPr>
+          <w:rStyle w:val="AttributeTok"/>
+        </w:rPr>
+        <w:t xml:space="preserve">title =</w:t>
+      </w:r>
+      <w:r>
+        <w:rPr>
+          <w:rStyle w:val="NormalTok"/>
+        </w:rPr>
+        <w:t xml:space="preserve"> </w:t>
+      </w:r>
+      <w:r>
+        <w:rPr>
+          <w:rStyle w:val="StringTok"/>
+        </w:rPr>
+        <w:t xml:space="preserve">"Q-Q Plot for age"</w:t>
+      </w:r>
+      <w:r>
+        <w:rPr>
+          <w:rStyle w:val="NormalTok"/>
+        </w:rPr>
+        <w:t xml:space="preserve">,</w:t>
+      </w:r>
+      <w:r>
+        <w:br/>
+      </w:r>
+      <w:r>
+        <w:rPr>
+          <w:rStyle w:val="NormalTok"/>
+        </w:rPr>
+        <w:t xml:space="preserve">       </w:t>
+      </w:r>
+      <w:r>
+        <w:rPr>
+          <w:rStyle w:val="AttributeTok"/>
+        </w:rPr>
+        <w:t xml:space="preserve">x =</w:t>
+      </w:r>
+      <w:r>
+        <w:rPr>
+          <w:rStyle w:val="NormalTok"/>
+        </w:rPr>
+        <w:t xml:space="preserve"> </w:t>
+      </w:r>
+      <w:r>
+        <w:rPr>
+          <w:rStyle w:val="StringTok"/>
+        </w:rPr>
+        <w:t xml:space="preserve">"Theoretical Quantiles"</w:t>
+      </w:r>
+      <w:r>
+        <w:rPr>
+          <w:rStyle w:val="NormalTok"/>
+        </w:rPr>
+        <w:t xml:space="preserve">,</w:t>
+      </w:r>
+      <w:r>
+        <w:br/>
+      </w:r>
+      <w:r>
+        <w:rPr>
+          <w:rStyle w:val="NormalTok"/>
+        </w:rPr>
+        <w:t xml:space="preserve">       </w:t>
+      </w:r>
+      <w:r>
+        <w:rPr>
+          <w:rStyle w:val="AttributeTok"/>
+        </w:rPr>
+        <w:t xml:space="preserve">y =</w:t>
+      </w:r>
+      <w:r>
+        <w:rPr>
+          <w:rStyle w:val="NormalTok"/>
+        </w:rPr>
+        <w:t xml:space="preserve"> </w:t>
+      </w:r>
+      <w:r>
+        <w:rPr>
+          <w:rStyle w:val="StringTok"/>
+        </w:rPr>
+        <w:t xml:space="preserve">"Sample Quantiles"</w:t>
+      </w:r>
+      <w:r>
+        <w:rPr>
+          <w:rStyle w:val="NormalTok"/>
+        </w:rPr>
+        <w:t xml:space="preserve">) </w:t>
+      </w:r>
+      <w:r>
+        <w:rPr>
+          <w:rStyle w:val="SpecialCharTok"/>
+        </w:rPr>
+        <w:t xml:space="preserve">+</w:t>
+      </w:r>
+      <w:r>
+        <w:br/>
+      </w:r>
+      <w:r>
+        <w:rPr>
+          <w:rStyle w:val="NormalTok"/>
+        </w:rPr>
+        <w:t xml:space="preserve">  </w:t>
+      </w:r>
+      <w:r>
+        <w:rPr>
+          <w:rStyle w:val="FunctionTok"/>
+        </w:rPr>
+        <w:t xml:space="preserve">theme_minimal</w:t>
+      </w:r>
+      <w:r>
+        <w:rPr>
+          <w:rStyle w:val="NormalTok"/>
+        </w:rPr>
+        <w:t xml:space="preserve">()</w:t>
+      </w:r>
+      <w:r>
+        <w:br/>
+      </w:r>
+      <w:r>
+        <w:br/>
+      </w:r>
+      <w:r>
+        <w:rPr>
+          <w:rStyle w:val="CommentTok"/>
+        </w:rPr>
+        <w:t xml:space="preserve"># Combine the plots</w:t>
+      </w:r>
+      <w:r>
+        <w:br/>
+      </w:r>
+      <w:r>
+        <w:rPr>
+          <w:rStyle w:val="NormalTok"/>
+        </w:rPr>
+        <w:t xml:space="preserve">(p1_lion </w:t>
+      </w:r>
+      <w:r>
+        <w:rPr>
+          <w:rStyle w:val="SpecialCharTok"/>
+        </w:rPr>
+        <w:t xml:space="preserve">/</w:t>
+      </w:r>
+      <w:r>
+        <w:rPr>
+          <w:rStyle w:val="NormalTok"/>
+        </w:rPr>
+        <w:t xml:space="preserve"> p2_lion) </w:t>
+      </w:r>
+      <w:r>
+        <w:rPr>
+          <w:rStyle w:val="SpecialCharTok"/>
+        </w:rPr>
+        <w:t xml:space="preserve">|</w:t>
+      </w:r>
+      <w:r>
+        <w:rPr>
+          <w:rStyle w:val="NormalTok"/>
+        </w:rPr>
+        <w:t xml:space="preserve"> (p3_lion </w:t>
+      </w:r>
+      <w:r>
+        <w:rPr>
+          <w:rStyle w:val="SpecialCharTok"/>
+        </w:rPr>
+        <w:t xml:space="preserve">/</w:t>
+      </w:r>
+      <w:r>
+        <w:rPr>
+          <w:rStyle w:val="NormalTok"/>
+        </w:rPr>
+        <w:t xml:space="preserve"> p4_lion)</w:t>
+      </w:r>
+    </w:p>
     <w:p>
       <w:pPr>
         <w:pStyle w:val="FirstParagraph"/>
@@ -2563,18 +3482,18 @@
           <wp:inline>
             <wp:extent cx="2743200" cy="2743200"/>
             <wp:effectExtent b="0" l="0" r="0" t="0"/>
-            <wp:docPr descr="" title="" id="57" name="Picture"/>
+            <wp:docPr descr="" title="" id="54" name="Picture"/>
             <a:graphic>
               <a:graphicData uri="http://schemas.openxmlformats.org/drawingml/2006/picture">
                 <pic:pic>
                   <pic:nvPicPr>
-                    <pic:cNvPr descr="09_01_lecture_powerpoint_files/figure-docx/overview-plot-1o-1.png" id="58" name="Picture"/>
+                    <pic:cNvPr descr="09_01_lecture_powerpoint_files/figure-docx/overview-plot-2m-1.png" id="55" name="Picture"/>
                     <pic:cNvPicPr>
                       <a:picLocks noChangeArrowheads="1" noChangeAspect="1"/>
                     </pic:cNvPicPr>
                   </pic:nvPicPr>
                   <pic:blipFill>
-                    <a:blip r:embed="rId56"/>
+                    <a:blip r:embed="rId53"/>
                     <a:stretch>
                       <a:fillRect/>
                     </a:stretch>
@@ -2601,8 +3520,9 @@
         </w:drawing>
       </w:r>
     </w:p>
-    <w:bookmarkEnd w:id="59"/>
-    <w:bookmarkStart w:id="64" w:name="lecture-9-linear-regression"/>
+    <w:bookmarkEnd w:id="56"/>
+    <w:bookmarkEnd w:id="57"/>
+    <w:bookmarkStart w:id="58" w:name="lecture-9-correlation-analysis-6"/>
     <w:p>
       <w:pPr>
         <w:pStyle w:val="Heading1"/>
@@ -2618,10 +3538,452 @@
         <w:t xml:space="preserve"> </w:t>
       </w:r>
       <w:r>
+        <w:t xml:space="preserve">Correlation Analysis</w:t>
+      </w:r>
+    </w:p>
+    <w:p>
+      <w:pPr>
+        <w:pStyle w:val="FirstParagraph"/>
+      </w:pPr>
+      <w:r>
+        <w:t xml:space="preserve">To understand the amount of variation explained, you can square the non</w:t>
+      </w:r>
+      <w:r>
+        <w:t xml:space="preserve"> </w:t>
+      </w:r>
+      <w:r>
+        <w:t xml:space="preserve">parametric Spearman’s rho value.</w:t>
+      </w:r>
+    </w:p>
+    <w:p>
+      <w:pPr>
+        <w:pStyle w:val="BodyText"/>
+      </w:pPr>
+      <w:r>
+        <w:t xml:space="preserve">For your value of 0.74485:</w:t>
+      </w:r>
+    </w:p>
+    <w:p>
+      <w:pPr>
+        <w:pStyle w:val="BodyText"/>
+      </w:pPr>
+      <w:r>
+        <w:t xml:space="preserve">ρ² = 0.74485² = 0.5548</w:t>
+      </w:r>
+    </w:p>
+    <w:p>
+      <w:pPr>
+        <w:pStyle w:val="BodyText"/>
+      </w:pPr>
+      <w:r>
+        <w:t xml:space="preserve">This means approximately 55.48% of the variance in ranks of one variable</w:t>
+      </w:r>
+      <w:r>
+        <w:t xml:space="preserve"> </w:t>
+      </w:r>
+      <w:r>
+        <w:t xml:space="preserve">can be explained by the ranks of the other variable. This is similar to</w:t>
+      </w:r>
+      <w:r>
+        <w:t xml:space="preserve"> </w:t>
+      </w:r>
+      <w:r>
+        <w:t xml:space="preserve">how R² works in linear regression, but specifically for ranked data.</w:t>
+      </w:r>
+    </w:p>
+    <w:p>
+      <w:pPr>
+        <w:pStyle w:val="SourceCode"/>
+      </w:pPr>
+      <w:r>
+        <w:br/>
+      </w:r>
+      <w:r>
+        <w:rPr>
+          <w:rStyle w:val="VerbatimChar"/>
+        </w:rPr>
+        <w:t xml:space="preserve">    Spearman's rank correlation rho</w:t>
+      </w:r>
+      <w:r>
+        <w:br/>
+      </w:r>
+      <w:r>
+        <w:br/>
+      </w:r>
+      <w:r>
+        <w:rPr>
+          <w:rStyle w:val="VerbatimChar"/>
+        </w:rPr>
+        <w:t xml:space="preserve">data:  lion_data$proportion_black and lion_data$age_years</w:t>
+      </w:r>
+      <w:r>
+        <w:br/>
+      </w:r>
+      <w:r>
+        <w:rPr>
+          <w:rStyle w:val="VerbatimChar"/>
+        </w:rPr>
+        <w:t xml:space="preserve">S = 1392.1, p-value = 1.013e-06</w:t>
+      </w:r>
+      <w:r>
+        <w:br/>
+      </w:r>
+      <w:r>
+        <w:rPr>
+          <w:rStyle w:val="VerbatimChar"/>
+        </w:rPr>
+        <w:t xml:space="preserve">alternative hypothesis: true rho is not equal to 0</w:t>
+      </w:r>
+      <w:r>
+        <w:br/>
+      </w:r>
+      <w:r>
+        <w:rPr>
+          <w:rStyle w:val="VerbatimChar"/>
+        </w:rPr>
+        <w:t xml:space="preserve">sample estimates:</w:t>
+      </w:r>
+      <w:r>
+        <w:br/>
+      </w:r>
+      <w:r>
+        <w:rPr>
+          <w:rStyle w:val="VerbatimChar"/>
+        </w:rPr>
+        <w:t xml:space="preserve">      rho </w:t>
+      </w:r>
+      <w:r>
+        <w:br/>
+      </w:r>
+      <w:r>
+        <w:rPr>
+          <w:rStyle w:val="VerbatimChar"/>
+        </w:rPr>
+        <w:t xml:space="preserve">0.7448561 </w:t>
+      </w:r>
+    </w:p>
+    <w:bookmarkEnd w:id="58"/>
+    <w:bookmarkStart w:id="63" w:name="lecture-9-correlation-analysis-7"/>
+    <w:p>
+      <w:pPr>
+        <w:pStyle w:val="Heading1"/>
+      </w:pPr>
+      <w:r>
+        <w:rPr>
+          <w:b/>
+          <w:bCs/>
+        </w:rPr>
+        <w:t xml:space="preserve">Lecture 9:</w:t>
+      </w:r>
+      <w:r>
+        <w:t xml:space="preserve"> </w:t>
+      </w:r>
+      <w:r>
+        <w:t xml:space="preserve">Correlation Analysis</w:t>
+      </w:r>
+    </w:p>
+    <w:bookmarkStart w:id="59" w:name="correlation-important-considerations"/>
+    <w:p>
+      <w:pPr>
+        <w:pStyle w:val="Heading3"/>
+      </w:pPr>
+      <w:r>
+        <w:t xml:space="preserve">Correlation: Important Considerations</w:t>
+      </w:r>
+    </w:p>
+    <w:p>
+      <w:pPr>
+        <w:pStyle w:val="FirstParagraph"/>
+      </w:pPr>
+      <w:r>
+        <w:rPr>
+          <w:b/>
+          <w:bCs/>
+        </w:rPr>
+        <w:t xml:space="preserve">The correlation coefficient depends on the range</w:t>
+      </w:r>
+    </w:p>
+    <w:p>
+      <w:pPr>
+        <w:pStyle w:val="Compact"/>
+        <w:numPr>
+          <w:ilvl w:val="0"/>
+          <w:numId w:val="1011"/>
+        </w:numPr>
+      </w:pPr>
+      <w:r>
+        <w:t xml:space="preserve">Restricting range of values can reduce the correlation coefficient</w:t>
+      </w:r>
+    </w:p>
+    <w:p>
+      <w:pPr>
+        <w:pStyle w:val="Compact"/>
+        <w:numPr>
+          <w:ilvl w:val="0"/>
+          <w:numId w:val="1011"/>
+        </w:numPr>
+      </w:pPr>
+      <w:r>
+        <w:t xml:space="preserve">Comparing correlations between studies requires similar ranges of</w:t>
+      </w:r>
+      <w:r>
+        <w:t xml:space="preserve"> </w:t>
+      </w:r>
+      <w:r>
+        <w:t xml:space="preserve">values</w:t>
+      </w:r>
+    </w:p>
+    <w:p>
+      <w:pPr>
+        <w:pStyle w:val="FirstParagraph"/>
+      </w:pPr>
+      <w:r>
+        <w:rPr>
+          <w:b/>
+          <w:bCs/>
+        </w:rPr>
+        <w:t xml:space="preserve">Measurement error affects correlation</w:t>
+      </w:r>
+    </w:p>
+    <w:p>
+      <w:pPr>
+        <w:pStyle w:val="Compact"/>
+        <w:numPr>
+          <w:ilvl w:val="0"/>
+          <w:numId w:val="1012"/>
+        </w:numPr>
+      </w:pPr>
+      <w:r>
+        <w:t xml:space="preserve">Measurement error in X or Y tends to weaken observed correlation</w:t>
+      </w:r>
+    </w:p>
+    <w:p>
+      <w:pPr>
+        <w:pStyle w:val="Compact"/>
+        <w:numPr>
+          <w:ilvl w:val="0"/>
+          <w:numId w:val="1012"/>
+        </w:numPr>
+      </w:pPr>
+      <w:r>
+        <w:t xml:space="preserve">This bias is called</w:t>
+      </w:r>
+      <w:r>
+        <w:t xml:space="preserve"> </w:t>
+      </w:r>
+      <w:r>
+        <w:rPr>
+          <w:b/>
+          <w:bCs/>
+        </w:rPr>
+        <w:t xml:space="preserve">attenuation</w:t>
+      </w:r>
+    </w:p>
+    <w:p>
+      <w:pPr>
+        <w:pStyle w:val="Compact"/>
+        <w:numPr>
+          <w:ilvl w:val="0"/>
+          <w:numId w:val="1012"/>
+        </w:numPr>
+      </w:pPr>
+      <w:r>
+        <w:t xml:space="preserve">True correlation typically stronger than observed correlation</w:t>
+      </w:r>
+    </w:p>
+    <w:p>
+      <w:pPr>
+        <w:pStyle w:val="FirstParagraph"/>
+      </w:pPr>
+      <w:r>
+        <w:rPr>
+          <w:b/>
+          <w:bCs/>
+        </w:rPr>
+        <w:t xml:space="preserve">Correlation vs. Causation</w:t>
+      </w:r>
+    </w:p>
+    <w:p>
+      <w:pPr>
+        <w:pStyle w:val="Compact"/>
+        <w:numPr>
+          <w:ilvl w:val="0"/>
+          <w:numId w:val="1013"/>
+        </w:numPr>
+      </w:pPr>
+      <w:r>
+        <w:t xml:space="preserve">Correlation does not imply causation</w:t>
+      </w:r>
+    </w:p>
+    <w:p>
+      <w:pPr>
+        <w:pStyle w:val="Compact"/>
+        <w:numPr>
+          <w:ilvl w:val="0"/>
+          <w:numId w:val="1013"/>
+        </w:numPr>
+      </w:pPr>
+      <w:r>
+        <w:t xml:space="preserve">Three possible explanations for correlation:</w:t>
+      </w:r>
+    </w:p>
+    <w:p>
+      <w:pPr>
+        <w:pStyle w:val="Compact"/>
+        <w:numPr>
+          <w:ilvl w:val="1"/>
+          <w:numId w:val="1014"/>
+        </w:numPr>
+      </w:pPr>
+      <w:r>
+        <w:t xml:space="preserve">X causes Y</w:t>
+      </w:r>
+    </w:p>
+    <w:p>
+      <w:pPr>
+        <w:pStyle w:val="Compact"/>
+        <w:numPr>
+          <w:ilvl w:val="1"/>
+          <w:numId w:val="1014"/>
+        </w:numPr>
+      </w:pPr>
+      <w:r>
+        <w:t xml:space="preserve">Y causes X</w:t>
+      </w:r>
+    </w:p>
+    <w:p>
+      <w:pPr>
+        <w:pStyle w:val="Compact"/>
+        <w:numPr>
+          <w:ilvl w:val="1"/>
+          <w:numId w:val="1014"/>
+        </w:numPr>
+      </w:pPr>
+      <w:r>
+        <w:t xml:space="preserve">Z (a third variable) causes both X and Y</w:t>
+      </w:r>
+    </w:p>
+    <w:p>
+      <w:pPr>
+        <w:pStyle w:val="FirstParagraph"/>
+      </w:pPr>
+      <w:r>
+        <w:rPr>
+          <w:b/>
+          <w:bCs/>
+        </w:rPr>
+        <w:t xml:space="preserve">Correlation significance test</w:t>
+      </w:r>
+    </w:p>
+    <w:p>
+      <w:pPr>
+        <w:pStyle w:val="Compact"/>
+        <w:numPr>
+          <w:ilvl w:val="0"/>
+          <w:numId w:val="1015"/>
+        </w:numPr>
+      </w:pPr>
+      <w:r>
+        <w:t xml:space="preserve">H₀: ρ = 0 (no correlation in population)</w:t>
+      </w:r>
+    </w:p>
+    <w:p>
+      <w:pPr>
+        <w:pStyle w:val="Compact"/>
+        <w:numPr>
+          <w:ilvl w:val="0"/>
+          <w:numId w:val="1015"/>
+        </w:numPr>
+      </w:pPr>
+      <w:r>
+        <w:t xml:space="preserve">H₁: ρ ≠ 0 (correlation exists in population)</w:t>
+      </w:r>
+    </w:p>
+    <w:p>
+      <w:pPr>
+        <w:pStyle w:val="Compact"/>
+        <w:numPr>
+          <w:ilvl w:val="0"/>
+          <w:numId w:val="1015"/>
+        </w:numPr>
+      </w:pPr>
+      <w:r>
+        <w:rPr>
+          <w:b/>
+          <w:bCs/>
+        </w:rPr>
+        <w:t xml:space="preserve">Test statistic: t = r / SE(r) with df = n-2</w:t>
+      </w:r>
+    </w:p>
+    <w:bookmarkEnd w:id="59"/>
+    <w:p>
+      <w:pPr>
+        <w:pStyle w:val="FirstParagraph"/>
+      </w:pPr>
+      <w:r>
+        <w:drawing>
+          <wp:inline>
+            <wp:extent cx="2743200" cy="2743200"/>
+            <wp:effectExtent b="0" l="0" r="0" t="0"/>
+            <wp:docPr descr="" title="" id="61" name="Picture"/>
+            <a:graphic>
+              <a:graphicData uri="http://schemas.openxmlformats.org/drawingml/2006/picture">
+                <pic:pic>
+                  <pic:nvPicPr>
+                    <pic:cNvPr descr="09_01_lecture_powerpoint_files/figure-docx/overview-plot-1o-1.png" id="62" name="Picture"/>
+                    <pic:cNvPicPr>
+                      <a:picLocks noChangeArrowheads="1" noChangeAspect="1"/>
+                    </pic:cNvPicPr>
+                  </pic:nvPicPr>
+                  <pic:blipFill>
+                    <a:blip r:embed="rId60"/>
+                    <a:stretch>
+                      <a:fillRect/>
+                    </a:stretch>
+                  </pic:blipFill>
+                  <pic:spPr bwMode="auto">
+                    <a:xfrm>
+                      <a:off x="0" y="0"/>
+                      <a:ext cx="2743200" cy="2743200"/>
+                    </a:xfrm>
+                    <a:prstGeom prst="rect">
+                      <a:avLst/>
+                    </a:prstGeom>
+                    <a:noFill/>
+                    <a:ln w="9525">
+                      <a:noFill/>
+                      <a:headEnd/>
+                      <a:tailEnd/>
+                    </a:ln>
+                  </pic:spPr>
+                </pic:pic>
+              </a:graphicData>
+            </a:graphic>
+          </wp:inline>
+        </w:drawing>
+      </w:r>
+    </w:p>
+    <w:bookmarkEnd w:id="63"/>
+    <w:bookmarkStart w:id="68" w:name="lecture-9-linear-regression"/>
+    <w:p>
+      <w:pPr>
+        <w:pStyle w:val="Heading1"/>
+      </w:pPr>
+      <w:r>
+        <w:rPr>
+          <w:b/>
+          <w:bCs/>
+        </w:rPr>
+        <w:t xml:space="preserve">Lecture 9:</w:t>
+      </w:r>
+      <w:r>
+        <w:t xml:space="preserve"> </w:t>
+      </w:r>
+      <w:r>
         <w:t xml:space="preserve">Linear Regression</w:t>
       </w:r>
     </w:p>
-    <w:bookmarkStart w:id="60" w:name="simple-linear-regression-model"/>
+    <w:bookmarkStart w:id="64" w:name="simple-linear-regression-model"/>
     <w:p>
       <w:pPr>
         <w:pStyle w:val="Heading3"/>
@@ -2944,7 +4306,7 @@
         <w:t xml:space="preserve">values.</w:t>
       </w:r>
     </w:p>
-    <w:bookmarkEnd w:id="60"/>
+    <w:bookmarkEnd w:id="64"/>
     <w:p>
       <w:pPr>
         <w:pStyle w:val="BodyText"/>
@@ -2954,18 +4316,18 @@
           <wp:inline>
             <wp:extent cx="3133725" cy="8418962"/>
             <wp:effectExtent b="0" l="0" r="0" t="0"/>
-            <wp:docPr descr="" title="" id="62" name="Picture"/>
+            <wp:docPr descr="" title="" id="66" name="Picture"/>
             <a:graphic>
               <a:graphicData uri="http://schemas.openxmlformats.org/drawingml/2006/picture">
                 <pic:pic>
                   <pic:nvPicPr>
-                    <pic:cNvPr descr="images/clipboard-3360244964.png" id="63" name="Picture"/>
+                    <pic:cNvPr descr="images/clipboard-3360244964.png" id="67" name="Picture"/>
                     <pic:cNvPicPr>
                       <a:picLocks noChangeArrowheads="1" noChangeAspect="1"/>
                     </pic:cNvPicPr>
                   </pic:nvPicPr>
                   <pic:blipFill>
-                    <a:blip r:embed="rId61"/>
+                    <a:blip r:embed="rId65"/>
                     <a:stretch>
                       <a:fillRect/>
                     </a:stretch>
@@ -2992,8 +4354,8 @@
         </w:drawing>
       </w:r>
     </w:p>
-    <w:bookmarkEnd w:id="64"/>
-    <w:bookmarkStart w:id="69" w:name="lecture-9-linear-regression-1"/>
+    <w:bookmarkEnd w:id="68"/>
+    <w:bookmarkStart w:id="73" w:name="lecture-9-linear-regression-1"/>
     <w:p>
       <w:pPr>
         <w:pStyle w:val="Heading1"/>
@@ -3012,7 +4374,7 @@
         <w:t xml:space="preserve">Linear Regression</w:t>
       </w:r>
     </w:p>
-    <w:bookmarkStart w:id="65" w:name="simple-linear-regression-model-1"/>
+    <w:bookmarkStart w:id="69" w:name="simple-linear-regression-model-1"/>
     <w:p>
       <w:pPr>
         <w:pStyle w:val="Heading3"/>
@@ -3327,7 +4689,7 @@
         <w:t xml:space="preserve">values.</w:t>
       </w:r>
     </w:p>
-    <w:bookmarkEnd w:id="65"/>
+    <w:bookmarkEnd w:id="69"/>
     <w:p>
       <w:pPr>
         <w:pStyle w:val="BodyText"/>
@@ -3337,18 +4699,18 @@
           <wp:inline>
             <wp:extent cx="2743200" cy="2743200"/>
             <wp:effectExtent b="0" l="0" r="0" t="0"/>
-            <wp:docPr descr="" title="" id="67" name="Picture"/>
+            <wp:docPr descr="" title="" id="71" name="Picture"/>
             <a:graphic>
               <a:graphicData uri="http://schemas.openxmlformats.org/drawingml/2006/picture">
                 <pic:pic>
                   <pic:nvPicPr>
-                    <pic:cNvPr descr="09_01_lecture_powerpoint_files/figure-docx/overview-plot-1p-1.png" id="68" name="Picture"/>
+                    <pic:cNvPr descr="09_01_lecture_powerpoint_files/figure-docx/overview-plot-1p-1.png" id="72" name="Picture"/>
                     <pic:cNvPicPr>
                       <a:picLocks noChangeArrowheads="1" noChangeAspect="1"/>
                     </pic:cNvPicPr>
                   </pic:nvPicPr>
                   <pic:blipFill>
-                    <a:blip r:embed="rId66"/>
+                    <a:blip r:embed="rId70"/>
                     <a:stretch>
                       <a:fillRect/>
                     </a:stretch>
@@ -3375,8 +4737,8 @@
         </w:drawing>
       </w:r>
     </w:p>
-    <w:bookmarkEnd w:id="69"/>
-    <w:bookmarkStart w:id="74" w:name="lecture-9-linear-regression-2"/>
+    <w:bookmarkEnd w:id="73"/>
+    <w:bookmarkStart w:id="78" w:name="lecture-9-linear-regression-2"/>
     <w:p>
       <w:pPr>
         <w:pStyle w:val="Heading1"/>
@@ -3409,7 +4771,7 @@
         <w:t xml:space="preserve">is:</w:t>
       </w:r>
     </w:p>
-    <w:bookmarkStart w:id="70" w:name="X0634c7febc72669521278c2dbcc32429720d7b9"/>
+    <w:bookmarkStart w:id="74" w:name="X0634c7febc72669521278c2dbcc32429720d7b9"/>
     <w:p>
       <w:pPr>
         <w:pStyle w:val="Heading3"/>
@@ -3502,7 +4864,7 @@
         <w:t xml:space="preserve">lions with more black on their noses tend to be older</w:t>
       </w:r>
     </w:p>
-    <w:bookmarkEnd w:id="70"/>
+    <w:bookmarkEnd w:id="74"/>
     <w:p>
       <w:pPr>
         <w:pStyle w:val="BodyText"/>
@@ -3512,18 +4874,18 @@
           <wp:inline>
             <wp:extent cx="2743200" cy="2743200"/>
             <wp:effectExtent b="0" l="0" r="0" t="0"/>
-            <wp:docPr descr="" title="" id="72" name="Picture"/>
+            <wp:docPr descr="" title="" id="76" name="Picture"/>
             <a:graphic>
               <a:graphicData uri="http://schemas.openxmlformats.org/drawingml/2006/picture">
                 <pic:pic>
                   <pic:nvPicPr>
-                    <pic:cNvPr descr="09_01_lecture_powerpoint_files/figure-docx/overview-plot-1q-1.png" id="73" name="Picture"/>
+                    <pic:cNvPr descr="09_01_lecture_powerpoint_files/figure-docx/overview-plot-1q-1.png" id="77" name="Picture"/>
                     <pic:cNvPicPr>
                       <a:picLocks noChangeArrowheads="1" noChangeAspect="1"/>
                     </pic:cNvPicPr>
                   </pic:nvPicPr>
                   <pic:blipFill>
-                    <a:blip r:embed="rId71"/>
+                    <a:blip r:embed="rId75"/>
                     <a:stretch>
                       <a:fillRect/>
                     </a:stretch>
@@ -3550,8 +4912,8 @@
         </w:drawing>
       </w:r>
     </w:p>
-    <w:bookmarkEnd w:id="74"/>
-    <w:bookmarkStart w:id="76" w:name="lecture-9-linear-regression-3"/>
+    <w:bookmarkEnd w:id="78"/>
+    <w:bookmarkStart w:id="80" w:name="lecture-9-linear-regression-3"/>
     <w:p>
       <w:pPr>
         <w:pStyle w:val="Heading1"/>
@@ -3570,7 +4932,7 @@
         <w:t xml:space="preserve">Linear Regression</w:t>
       </w:r>
     </w:p>
-    <w:bookmarkStart w:id="75" w:name="simple-linear-regression-model-2"/>
+    <w:bookmarkStart w:id="79" w:name="simple-linear-regression-model-2"/>
     <w:p>
       <w:pPr>
         <w:pStyle w:val="Heading3"/>
@@ -3749,9 +5111,9 @@
         <w:t xml:space="preserve">F-statistic: 49.75 on 1 and 30 DF,  p-value: 7.677e-08</w:t>
       </w:r>
     </w:p>
-    <w:bookmarkEnd w:id="75"/>
-    <w:bookmarkEnd w:id="76"/>
-    <w:bookmarkStart w:id="81" w:name="lecture-9-linear-regression-4"/>
+    <w:bookmarkEnd w:id="79"/>
+    <w:bookmarkEnd w:id="80"/>
+    <w:bookmarkStart w:id="85" w:name="lecture-9-linear-regression-4"/>
     <w:p>
       <w:pPr>
         <w:pStyle w:val="Heading1"/>
@@ -3770,7 +5132,7 @@
         <w:t xml:space="preserve">Linear Regression</w:t>
       </w:r>
     </w:p>
-    <w:bookmarkStart w:id="77" w:name="simple-linear-regression-model-3"/>
+    <w:bookmarkStart w:id="81" w:name="simple-linear-regression-model-3"/>
     <w:p>
       <w:pPr>
         <w:pStyle w:val="Heading3"/>
@@ -4533,7 +5895,7 @@
         <w:t xml:space="preserve">from the mean.</w:t>
       </w:r>
     </w:p>
-    <w:bookmarkEnd w:id="77"/>
+    <w:bookmarkEnd w:id="81"/>
     <w:p>
       <w:pPr>
         <w:pStyle w:val="BodyText"/>
@@ -4543,18 +5905,18 @@
           <wp:inline>
             <wp:extent cx="4572000" cy="3657600"/>
             <wp:effectExtent b="0" l="0" r="0" t="0"/>
-            <wp:docPr descr="" title="" id="79" name="Picture"/>
+            <wp:docPr descr="" title="" id="83" name="Picture"/>
             <a:graphic>
               <a:graphicData uri="http://schemas.openxmlformats.org/drawingml/2006/picture">
                 <pic:pic>
                   <pic:nvPicPr>
-                    <pic:cNvPr descr="09_01_lecture_powerpoint_files/figure-docx/overview-plot-1b-1.png" id="80" name="Picture"/>
+                    <pic:cNvPr descr="09_01_lecture_powerpoint_files/figure-docx/overview-plot-1b-1.png" id="84" name="Picture"/>
                     <pic:cNvPicPr>
                       <a:picLocks noChangeArrowheads="1" noChangeAspect="1"/>
                     </pic:cNvPicPr>
                   </pic:nvPicPr>
                   <pic:blipFill>
-                    <a:blip r:embed="rId78"/>
+                    <a:blip r:embed="rId82"/>
                     <a:stretch>
                       <a:fillRect/>
                     </a:stretch>
@@ -4581,8 +5943,8 @@
         </w:drawing>
       </w:r>
     </w:p>
-    <w:bookmarkEnd w:id="81"/>
-    <w:bookmarkStart w:id="83" w:name="lecture-9-linear-regression-5"/>
+    <w:bookmarkEnd w:id="85"/>
+    <w:bookmarkStart w:id="87" w:name="lecture-9-linear-regression-5"/>
     <w:p>
       <w:pPr>
         <w:pStyle w:val="Heading1"/>
@@ -4601,7 +5963,7 @@
         <w:t xml:space="preserve">Linear Regression</w:t>
       </w:r>
     </w:p>
-    <w:bookmarkStart w:id="82" w:name="example-prairie-home-companion"/>
+    <w:bookmarkStart w:id="86" w:name="example-prairie-home-companion"/>
     <w:p>
       <w:pPr>
         <w:pStyle w:val="Heading3"/>
@@ -4942,9 +6304,9 @@
         <w:t xml:space="preserve">Signif. codes:  0 '***' 0.001 '**' 0.01 '*' 0.05 '.' 0.1 ' ' 1</w:t>
       </w:r>
     </w:p>
-    <w:bookmarkEnd w:id="82"/>
-    <w:bookmarkEnd w:id="83"/>
-    <w:bookmarkStart w:id="88" w:name="lecture-9-linear-regression-6"/>
+    <w:bookmarkEnd w:id="86"/>
+    <w:bookmarkEnd w:id="87"/>
+    <w:bookmarkStart w:id="92" w:name="lecture-9-linear-regression-6"/>
     <w:p>
       <w:pPr>
         <w:pStyle w:val="Heading1"/>
@@ -4995,7 +6357,7 @@
         <w:t xml:space="preserve">H₁: β ≠ 0 (species number does affect stability)</w:t>
       </w:r>
     </w:p>
-    <w:bookmarkStart w:id="84" w:name="Xc23b8c32fe58924407392bb1acfc082a2222e7c"/>
+    <w:bookmarkStart w:id="88" w:name="Xc23b8c32fe58924407392bb1acfc082a2222e7c"/>
     <w:p>
       <w:pPr>
         <w:pStyle w:val="Heading3"/>
@@ -5145,7 +6507,7 @@
         <w:t xml:space="preserve">communities have more stable biomass production over time.</w:t>
       </w:r>
     </w:p>
-    <w:bookmarkEnd w:id="84"/>
+    <w:bookmarkEnd w:id="88"/>
     <w:p>
       <w:pPr>
         <w:pStyle w:val="BodyText"/>
@@ -5155,18 +6517,18 @@
           <wp:inline>
             <wp:extent cx="2743200" cy="2743200"/>
             <wp:effectExtent b="0" l="0" r="0" t="0"/>
-            <wp:docPr descr="" title="" id="86" name="Picture"/>
+            <wp:docPr descr="" title="" id="90" name="Picture"/>
             <a:graphic>
               <a:graphicData uri="http://schemas.openxmlformats.org/drawingml/2006/picture">
                 <pic:pic>
                   <pic:nvPicPr>
-                    <pic:cNvPr descr="09_01_lecture_powerpoint_files/figure-docx/overview-plot-1d-1.png" id="87" name="Picture"/>
+                    <pic:cNvPr descr="09_01_lecture_powerpoint_files/figure-docx/overview-plot-1d-1.png" id="91" name="Picture"/>
                     <pic:cNvPicPr>
                       <a:picLocks noChangeArrowheads="1" noChangeAspect="1"/>
                     </pic:cNvPicPr>
                   </pic:nvPicPr>
                   <pic:blipFill>
-                    <a:blip r:embed="rId85"/>
+                    <a:blip r:embed="rId89"/>
                     <a:stretch>
                       <a:fillRect/>
                     </a:stretch>
@@ -5193,8 +6555,8 @@
         </w:drawing>
       </w:r>
     </w:p>
-    <w:bookmarkEnd w:id="88"/>
-    <w:bookmarkStart w:id="93" w:name="lecture-9-linear-regression-7"/>
+    <w:bookmarkEnd w:id="92"/>
+    <w:bookmarkStart w:id="97" w:name="lecture-9-linear-regression-7"/>
     <w:p>
       <w:pPr>
         <w:pStyle w:val="Heading1"/>
@@ -5213,7 +6575,7 @@
         <w:t xml:space="preserve">Linear Regression</w:t>
       </w:r>
     </w:p>
-    <w:bookmarkStart w:id="89" w:name="testing-regression-assumptions"/>
+    <w:bookmarkStart w:id="93" w:name="testing-regression-assumptions"/>
     <w:p>
       <w:pPr>
         <w:pStyle w:val="Heading3"/>
@@ -5435,7 +6797,7 @@
         <w:t xml:space="preserve">has a mean of 0 at each xi</w:t>
       </w:r>
     </w:p>
-    <w:bookmarkEnd w:id="89"/>
+    <w:bookmarkEnd w:id="93"/>
     <w:p>
       <w:pPr>
         <w:pStyle w:val="FirstParagraph"/>
@@ -5445,18 +6807,18 @@
           <wp:inline>
             <wp:extent cx="6578600" cy="3746994"/>
             <wp:effectExtent b="0" l="0" r="0" t="0"/>
-            <wp:docPr descr="" title="" id="91" name="Picture"/>
+            <wp:docPr descr="" title="" id="95" name="Picture"/>
             <a:graphic>
               <a:graphicData uri="http://schemas.openxmlformats.org/drawingml/2006/picture">
                 <pic:pic>
                   <pic:nvPicPr>
-                    <pic:cNvPr descr="images/clipboard-2092034232.png" id="92" name="Picture"/>
+                    <pic:cNvPr descr="images/clipboard-2092034232.png" id="96" name="Picture"/>
                     <pic:cNvPicPr>
                       <a:picLocks noChangeArrowheads="1" noChangeAspect="1"/>
                     </pic:cNvPicPr>
                   </pic:nvPicPr>
                   <pic:blipFill>
-                    <a:blip r:embed="rId90"/>
+                    <a:blip r:embed="rId94"/>
                     <a:stretch>
                       <a:fillRect/>
                     </a:stretch>
@@ -5483,8 +6845,8 @@
         </w:drawing>
       </w:r>
     </w:p>
-    <w:bookmarkEnd w:id="93"/>
-    <w:bookmarkStart w:id="99" w:name="lecture-9-linear-regression-8"/>
+    <w:bookmarkEnd w:id="97"/>
+    <w:bookmarkStart w:id="103" w:name="lecture-9-linear-regression-8"/>
     <w:p>
       <w:pPr>
         <w:pStyle w:val="Heading1"/>
@@ -5503,7 +6865,7 @@
         <w:t xml:space="preserve">Linear Regression</w:t>
       </w:r>
     </w:p>
-    <w:bookmarkStart w:id="94" w:name="testing-regression-assumptions-1"/>
+    <w:bookmarkStart w:id="98" w:name="testing-regression-assumptions-1"/>
     <w:p>
       <w:pPr>
         <w:pStyle w:val="Heading3"/>
@@ -5710,8 +7072,8 @@
         <w:t xml:space="preserve">(MSE) as</w:t>
       </w:r>
     </w:p>
-    <w:bookmarkEnd w:id="94"/>
-    <w:bookmarkStart w:id="95" w:name="sum_i1n-y_i---haty_i2"/>
+    <w:bookmarkEnd w:id="98"/>
+    <w:bookmarkStart w:id="99" w:name="sum_i1n-y_i---haty_i2"/>
     <w:p>
       <w:pPr>
         <w:pStyle w:val="Heading3"/>
@@ -5810,7 +7172,7 @@
         </m:sSup>
       </m:oMath>
     </w:p>
-    <w:bookmarkEnd w:id="95"/>
+    <w:bookmarkEnd w:id="99"/>
     <w:p>
       <w:pPr>
         <w:pStyle w:val="FirstParagraph"/>
@@ -5820,18 +7182,18 @@
           <wp:inline>
             <wp:extent cx="4936481" cy="3440190"/>
             <wp:effectExtent b="0" l="0" r="0" t="0"/>
-            <wp:docPr descr="" title="" id="97" name="Picture"/>
+            <wp:docPr descr="" title="" id="101" name="Picture"/>
             <a:graphic>
               <a:graphicData uri="http://schemas.openxmlformats.org/drawingml/2006/picture">
                 <pic:pic>
                   <pic:nvPicPr>
-                    <pic:cNvPr descr="images/clipboard-1411052425.png" id="98" name="Picture"/>
+                    <pic:cNvPr descr="images/clipboard-1411052425.png" id="102" name="Picture"/>
                     <pic:cNvPicPr>
                       <a:picLocks noChangeArrowheads="1" noChangeAspect="1"/>
                     </pic:cNvPicPr>
                   </pic:nvPicPr>
                   <pic:blipFill>
-                    <a:blip r:embed="rId96"/>
+                    <a:blip r:embed="rId100"/>
                     <a:stretch>
                       <a:fillRect/>
                     </a:stretch>
@@ -5858,15 +7220,15 @@
         </w:drawing>
       </w:r>
     </w:p>
-    <w:bookmarkEnd w:id="99"/>
-    <w:bookmarkStart w:id="100" w:name="section"/>
+    <w:bookmarkEnd w:id="103"/>
+    <w:bookmarkStart w:id="104" w:name="section"/>
     <w:p>
       <w:pPr>
         <w:pStyle w:val="Heading1"/>
       </w:pPr>
     </w:p>
-    <w:bookmarkEnd w:id="100"/>
-    <w:bookmarkStart w:id="105" w:name="lecture-9-linear-regression-9"/>
+    <w:bookmarkEnd w:id="104"/>
+    <w:bookmarkStart w:id="109" w:name="lecture-9-linear-regression-9"/>
     <w:p>
       <w:pPr>
         <w:pStyle w:val="Heading1"/>
@@ -5885,7 +7247,7 @@
         <w:t xml:space="preserve">Linear Regression</w:t>
       </w:r>
     </w:p>
-    <w:bookmarkStart w:id="101" w:name="testing-regression-assumptions-2"/>
+    <w:bookmarkStart w:id="105" w:name="testing-regression-assumptions-2"/>
     <w:p>
       <w:pPr>
         <w:pStyle w:val="Heading3"/>
@@ -5986,7 +7348,7 @@
         <w:t xml:space="preserve">Let’s check these assumptions for the lion regression model:</w:t>
       </w:r>
     </w:p>
-    <w:bookmarkEnd w:id="101"/>
+    <w:bookmarkEnd w:id="105"/>
     <w:p>
       <w:pPr>
         <w:pStyle w:val="BodyText"/>
@@ -5996,18 +7358,18 @@
           <wp:inline>
             <wp:extent cx="2743200" cy="2743200"/>
             <wp:effectExtent b="0" l="0" r="0" t="0"/>
-            <wp:docPr descr="" title="" id="103" name="Picture"/>
+            <wp:docPr descr="" title="" id="107" name="Picture"/>
             <a:graphic>
               <a:graphicData uri="http://schemas.openxmlformats.org/drawingml/2006/picture">
                 <pic:pic>
                   <pic:nvPicPr>
-                    <pic:cNvPr descr="09_01_lecture_powerpoint_files/figure-docx/overview-plot-1e-1.png" id="104" name="Picture"/>
+                    <pic:cNvPr descr="09_01_lecture_powerpoint_files/figure-docx/overview-plot-1e-1.png" id="108" name="Picture"/>
                     <pic:cNvPicPr>
                       <a:picLocks noChangeArrowheads="1" noChangeAspect="1"/>
                     </pic:cNvPicPr>
                   </pic:nvPicPr>
                   <pic:blipFill>
-                    <a:blip r:embed="rId102"/>
+                    <a:blip r:embed="rId106"/>
                     <a:stretch>
                       <a:fillRect/>
                     </a:stretch>
@@ -6034,8 +7396,8 @@
         </w:drawing>
       </w:r>
     </w:p>
-    <w:bookmarkEnd w:id="105"/>
-    <w:bookmarkStart w:id="110" w:name="lecture-9-linear-regression-10"/>
+    <w:bookmarkEnd w:id="109"/>
+    <w:bookmarkStart w:id="114" w:name="lecture-9-linear-regression-10"/>
     <w:p>
       <w:pPr>
         <w:pStyle w:val="Heading1"/>
@@ -6054,7 +7416,7 @@
         <w:t xml:space="preserve">Linear Regression</w:t>
       </w:r>
     </w:p>
-    <w:bookmarkStart w:id="106" w:name="testing-regression-assumptions-3"/>
+    <w:bookmarkStart w:id="110" w:name="testing-regression-assumptions-3"/>
     <w:p>
       <w:pPr>
         <w:pStyle w:val="Heading3"/>
@@ -6155,7 +7517,7 @@
         <w:t xml:space="preserve">Let’s check these assumptions for the lion regression model:</w:t>
       </w:r>
     </w:p>
-    <w:bookmarkEnd w:id="106"/>
+    <w:bookmarkEnd w:id="110"/>
     <w:p>
       <w:pPr>
         <w:pStyle w:val="BodyText"/>
@@ -6165,18 +7527,18 @@
           <wp:inline>
             <wp:extent cx="2743200" cy="2743200"/>
             <wp:effectExtent b="0" l="0" r="0" t="0"/>
-            <wp:docPr descr="" title="" id="108" name="Picture"/>
+            <wp:docPr descr="" title="" id="112" name="Picture"/>
             <a:graphic>
               <a:graphicData uri="http://schemas.openxmlformats.org/drawingml/2006/picture">
                 <pic:pic>
                   <pic:nvPicPr>
-                    <pic:cNvPr descr="09_01_lecture_powerpoint_files/figure-docx/overview-plot-1f-1.png" id="109" name="Picture"/>
+                    <pic:cNvPr descr="09_01_lecture_powerpoint_files/figure-docx/overview-plot-1f-1.png" id="113" name="Picture"/>
                     <pic:cNvPicPr>
                       <a:picLocks noChangeArrowheads="1" noChangeAspect="1"/>
                     </pic:cNvPicPr>
                   </pic:nvPicPr>
                   <pic:blipFill>
-                    <a:blip r:embed="rId107"/>
+                    <a:blip r:embed="rId111"/>
                     <a:stretch>
                       <a:fillRect/>
                     </a:stretch>
@@ -6203,8 +7565,8 @@
         </w:drawing>
       </w:r>
     </w:p>
-    <w:bookmarkEnd w:id="110"/>
-    <w:bookmarkStart w:id="112" w:name="lecture-9-linear-regression-11"/>
+    <w:bookmarkEnd w:id="114"/>
+    <w:bookmarkStart w:id="116" w:name="lecture-9-linear-regression-11"/>
     <w:p>
       <w:pPr>
         <w:pStyle w:val="Heading1"/>
@@ -6223,7 +7585,7 @@
         <w:t xml:space="preserve">Linear Regression</w:t>
       </w:r>
     </w:p>
-    <w:bookmarkStart w:id="111" w:name="testing-regression-assumptions-4"/>
+    <w:bookmarkStart w:id="115" w:name="testing-regression-assumptions-4"/>
     <w:p>
       <w:pPr>
         <w:pStyle w:val="Heading3"/>
@@ -6324,7 +7686,7 @@
         <w:t xml:space="preserve">Let’s check these assumptions for the lion regression model:</w:t>
       </w:r>
     </w:p>
-    <w:bookmarkEnd w:id="111"/>
+    <w:bookmarkEnd w:id="115"/>
     <w:p>
       <w:pPr>
         <w:pStyle w:val="SourceCode"/>
@@ -6360,8 +7722,8 @@
         <w:t xml:space="preserve">W = 0.93879, p-value = 0.0692</w:t>
       </w:r>
     </w:p>
-    <w:bookmarkEnd w:id="112"/>
-    <w:bookmarkStart w:id="117" w:name="lecture-9-linear-regression-12"/>
+    <w:bookmarkEnd w:id="116"/>
+    <w:bookmarkStart w:id="121" w:name="lecture-9-linear-regression-12"/>
     <w:p>
       <w:pPr>
         <w:pStyle w:val="Heading1"/>
@@ -6380,7 +7742,7 @@
         <w:t xml:space="preserve">Linear Regression</w:t>
       </w:r>
     </w:p>
-    <w:bookmarkStart w:id="113" w:name="simple-linear-regression-model-4"/>
+    <w:bookmarkStart w:id="117" w:name="simple-linear-regression-model-4"/>
     <w:p>
       <w:pPr>
         <w:pStyle w:val="Heading3"/>
@@ -6493,7 +7855,7 @@
         <w:t xml:space="preserve">models (Section 17.8)</w:t>
       </w:r>
     </w:p>
-    <w:bookmarkEnd w:id="113"/>
+    <w:bookmarkEnd w:id="117"/>
     <w:p>
       <w:pPr>
         <w:pStyle w:val="BodyText"/>
@@ -6503,18 +7865,18 @@
           <wp:inline>
             <wp:extent cx="4572000" cy="3657600"/>
             <wp:effectExtent b="0" l="0" r="0" t="0"/>
-            <wp:docPr descr="" title="" id="115" name="Picture"/>
+            <wp:docPr descr="" title="" id="119" name="Picture"/>
             <a:graphic>
               <a:graphicData uri="http://schemas.openxmlformats.org/drawingml/2006/picture">
                 <pic:pic>
                   <pic:nvPicPr>
-                    <pic:cNvPr descr="09_01_lecture_powerpoint_files/figure-docx/overview-plot-1h-1.png" id="116" name="Picture"/>
+                    <pic:cNvPr descr="09_01_lecture_powerpoint_files/figure-docx/overview-plot-1h-1.png" id="120" name="Picture"/>
                     <pic:cNvPicPr>
                       <a:picLocks noChangeArrowheads="1" noChangeAspect="1"/>
                     </pic:cNvPicPr>
                   </pic:nvPicPr>
                   <pic:blipFill>
-                    <a:blip r:embed="rId114"/>
+                    <a:blip r:embed="rId118"/>
                     <a:stretch>
                       <a:fillRect/>
                     </a:stretch>
@@ -6541,8 +7903,8 @@
         </w:drawing>
       </w:r>
     </w:p>
-    <w:bookmarkEnd w:id="117"/>
-    <w:bookmarkStart w:id="121" w:name="X3682556897e7ad430123163a33402634699a913"/>
+    <w:bookmarkEnd w:id="121"/>
+    <w:bookmarkStart w:id="125" w:name="X3682556897e7ad430123163a33402634699a913"/>
     <w:p>
       <w:pPr>
         <w:pStyle w:val="Heading1"/>
@@ -6615,18 +7977,18 @@
           <wp:inline>
             <wp:extent cx="6578600" cy="2439811"/>
             <wp:effectExtent b="0" l="0" r="0" t="0"/>
-            <wp:docPr descr="" title="" id="119" name="Picture"/>
+            <wp:docPr descr="" title="" id="123" name="Picture"/>
             <a:graphic>
               <a:graphicData uri="http://schemas.openxmlformats.org/drawingml/2006/picture">
                 <pic:pic>
                   <pic:nvPicPr>
-                    <pic:cNvPr descr="images/clipboard-934594306.png" id="120" name="Picture"/>
+                    <pic:cNvPr descr="images/clipboard-934594306.png" id="124" name="Picture"/>
                     <pic:cNvPicPr>
                       <a:picLocks noChangeArrowheads="1" noChangeAspect="1"/>
                     </pic:cNvPicPr>
                   </pic:nvPicPr>
                   <pic:blipFill>
-                    <a:blip r:embed="rId118"/>
+                    <a:blip r:embed="rId122"/>
                     <a:stretch>
                       <a:fillRect/>
                     </a:stretch>
@@ -6653,8 +8015,8 @@
         </w:drawing>
       </w:r>
     </w:p>
-    <w:bookmarkEnd w:id="121"/>
-    <w:bookmarkStart w:id="125" w:name="Xa60fc96c045d00e2e015537a5b928d109dd4e44"/>
+    <w:bookmarkEnd w:id="125"/>
+    <w:bookmarkStart w:id="129" w:name="Xa60fc96c045d00e2e015537a5b928d109dd4e44"/>
     <w:p>
       <w:pPr>
         <w:pStyle w:val="Heading1"/>
@@ -6726,18 +8088,18 @@
           <wp:inline>
             <wp:extent cx="6578600" cy="2206486"/>
             <wp:effectExtent b="0" l="0" r="0" t="0"/>
-            <wp:docPr descr="" title="" id="123" name="Picture"/>
+            <wp:docPr descr="" title="" id="127" name="Picture"/>
             <a:graphic>
               <a:graphicData uri="http://schemas.openxmlformats.org/drawingml/2006/picture">
                 <pic:pic>
                   <pic:nvPicPr>
-                    <pic:cNvPr descr="images/clipboard-2817787184.png" id="124" name="Picture"/>
+                    <pic:cNvPr descr="images/clipboard-2817787184.png" id="128" name="Picture"/>
                     <pic:cNvPicPr>
                       <a:picLocks noChangeArrowheads="1" noChangeAspect="1"/>
                     </pic:cNvPicPr>
                   </pic:nvPicPr>
                   <pic:blipFill>
-                    <a:blip r:embed="rId122"/>
+                    <a:blip r:embed="rId126"/>
                     <a:stretch>
                       <a:fillRect/>
                     </a:stretch>
@@ -6764,8 +8126,8 @@
         </w:drawing>
       </w:r>
     </w:p>
-    <w:bookmarkEnd w:id="125"/>
-    <w:bookmarkStart w:id="128" w:name="Xeb31f0320a8c9289d774edeb5b186847acd2653"/>
+    <w:bookmarkEnd w:id="129"/>
+    <w:bookmarkStart w:id="132" w:name="Xeb31f0320a8c9289d774edeb5b186847acd2653"/>
     <w:p>
       <w:pPr>
         <w:pStyle w:val="Heading1"/>
@@ -7115,18 +8477,18 @@
           <wp:inline>
             <wp:extent cx="6578600" cy="2206486"/>
             <wp:effectExtent b="0" l="0" r="0" t="0"/>
-            <wp:docPr descr="" title="" id="126" name="Picture"/>
+            <wp:docPr descr="" title="" id="130" name="Picture"/>
             <a:graphic>
               <a:graphicData uri="http://schemas.openxmlformats.org/drawingml/2006/picture">
                 <pic:pic>
                   <pic:nvPicPr>
-                    <pic:cNvPr descr="images/clipboard-2817787184.png" id="127" name="Picture"/>
+                    <pic:cNvPr descr="images/clipboard-2817787184.png" id="131" name="Picture"/>
                     <pic:cNvPicPr>
                       <a:picLocks noChangeArrowheads="1" noChangeAspect="1"/>
                     </pic:cNvPicPr>
                   </pic:nvPicPr>
                   <pic:blipFill>
-                    <a:blip r:embed="rId122"/>
+                    <a:blip r:embed="rId126"/>
                     <a:stretch>
                       <a:fillRect/>
                     </a:stretch>
@@ -7153,8 +8515,8 @@
         </w:drawing>
       </w:r>
     </w:p>
-    <w:bookmarkEnd w:id="128"/>
-    <w:bookmarkStart w:id="132" w:name="Xe45cd72931c545aeef2f0da5cd9a41ac082ac16"/>
+    <w:bookmarkEnd w:id="132"/>
+    <w:bookmarkStart w:id="136" w:name="Xe45cd72931c545aeef2f0da5cd9a41ac082ac16"/>
     <w:p>
       <w:pPr>
         <w:pStyle w:val="Heading1"/>
@@ -7504,18 +8866,18 @@
           <wp:inline>
             <wp:extent cx="6578600" cy="2151229"/>
             <wp:effectExtent b="0" l="0" r="0" t="0"/>
-            <wp:docPr descr="" title="" id="130" name="Picture"/>
+            <wp:docPr descr="" title="" id="134" name="Picture"/>
             <a:graphic>
               <a:graphicData uri="http://schemas.openxmlformats.org/drawingml/2006/picture">
                 <pic:pic>
                   <pic:nvPicPr>
-                    <pic:cNvPr descr="images/clipboard-77063277.png" id="131" name="Picture"/>
+                    <pic:cNvPr descr="images/clipboard-77063277.png" id="135" name="Picture"/>
                     <pic:cNvPicPr>
                       <a:picLocks noChangeArrowheads="1" noChangeAspect="1"/>
                     </pic:cNvPicPr>
                   </pic:nvPicPr>
                   <pic:blipFill>
-                    <a:blip r:embed="rId129"/>
+                    <a:blip r:embed="rId133"/>
                     <a:stretch>
                       <a:fillRect/>
                     </a:stretch>
@@ -7542,8 +8904,8 @@
         </w:drawing>
       </w:r>
     </w:p>
-    <w:bookmarkEnd w:id="132"/>
-    <w:bookmarkStart w:id="136" w:name="X37dacaa3ac63e264668a77bbcf24d4c4cdd9b8b"/>
+    <w:bookmarkEnd w:id="136"/>
+    <w:bookmarkStart w:id="140" w:name="X37dacaa3ac63e264668a77bbcf24d4c4cdd9b8b"/>
     <w:p>
       <w:pPr>
         <w:pStyle w:val="Heading1"/>
@@ -7762,18 +9124,18 @@
           <wp:inline>
             <wp:extent cx="6578600" cy="4725766"/>
             <wp:effectExtent b="0" l="0" r="0" t="0"/>
-            <wp:docPr descr="" title="" id="134" name="Picture"/>
+            <wp:docPr descr="" title="" id="138" name="Picture"/>
             <a:graphic>
               <a:graphicData uri="http://schemas.openxmlformats.org/drawingml/2006/picture">
                 <pic:pic>
                   <pic:nvPicPr>
-                    <pic:cNvPr descr="images/clipboard-217151541.png" id="135" name="Picture"/>
+                    <pic:cNvPr descr="images/clipboard-217151541.png" id="139" name="Picture"/>
                     <pic:cNvPicPr>
                       <a:picLocks noChangeArrowheads="1" noChangeAspect="1"/>
                     </pic:cNvPicPr>
                   </pic:nvPicPr>
                   <pic:blipFill>
-                    <a:blip r:embed="rId133"/>
+                    <a:blip r:embed="rId137"/>
                     <a:stretch>
                       <a:fillRect/>
                     </a:stretch>
@@ -7800,8 +9162,8 @@
         </w:drawing>
       </w:r>
     </w:p>
-    <w:bookmarkEnd w:id="136"/>
-    <w:bookmarkStart w:id="140" w:name="X5712b01ebd3d70f951e835de2ae744ccfe1fd5c"/>
+    <w:bookmarkEnd w:id="140"/>
+    <w:bookmarkStart w:id="144" w:name="X5712b01ebd3d70f951e835de2ae744ccfe1fd5c"/>
     <w:p>
       <w:pPr>
         <w:pStyle w:val="Heading1"/>
@@ -8109,18 +9471,18 @@
           <wp:inline>
             <wp:extent cx="6578600" cy="2162325"/>
             <wp:effectExtent b="0" l="0" r="0" t="0"/>
-            <wp:docPr descr="" title="" id="138" name="Picture"/>
+            <wp:docPr descr="" title="" id="142" name="Picture"/>
             <a:graphic>
               <a:graphicData uri="http://schemas.openxmlformats.org/drawingml/2006/picture">
                 <pic:pic>
                   <pic:nvPicPr>
-                    <pic:cNvPr descr="images/clipboard-2758972276.png" id="139" name="Picture"/>
+                    <pic:cNvPr descr="images/clipboard-2758972276.png" id="143" name="Picture"/>
                     <pic:cNvPicPr>
                       <a:picLocks noChangeArrowheads="1" noChangeAspect="1"/>
                     </pic:cNvPicPr>
                   </pic:nvPicPr>
                   <pic:blipFill>
-                    <a:blip r:embed="rId137"/>
+                    <a:blip r:embed="rId141"/>
                     <a:stretch>
                       <a:fillRect/>
                     </a:stretch>
@@ -8147,8 +9509,8 @@
         </w:drawing>
       </w:r>
     </w:p>
-    <w:bookmarkEnd w:id="140"/>
-    <w:bookmarkStart w:id="143" w:name="X3e6c93adb5fa1790360aa31567484de63ccc21a"/>
+    <w:bookmarkEnd w:id="144"/>
+    <w:bookmarkStart w:id="147" w:name="X3e6c93adb5fa1790360aa31567484de63ccc21a"/>
     <w:p>
       <w:pPr>
         <w:pStyle w:val="Heading1"/>
@@ -8320,18 +9682,18 @@
           <wp:inline>
             <wp:extent cx="6578600" cy="2162325"/>
             <wp:effectExtent b="0" l="0" r="0" t="0"/>
-            <wp:docPr descr="" title="" id="141" name="Picture"/>
+            <wp:docPr descr="" title="" id="145" name="Picture"/>
             <a:graphic>
               <a:graphicData uri="http://schemas.openxmlformats.org/drawingml/2006/picture">
                 <pic:pic>
                   <pic:nvPicPr>
-                    <pic:cNvPr descr="images/clipboard-2758972276.png" id="142" name="Picture"/>
+                    <pic:cNvPr descr="images/clipboard-2758972276.png" id="146" name="Picture"/>
                     <pic:cNvPicPr>
                       <a:picLocks noChangeArrowheads="1" noChangeAspect="1"/>
                     </pic:cNvPicPr>
                   </pic:nvPicPr>
                   <pic:blipFill>
-                    <a:blip r:embed="rId137"/>
+                    <a:blip r:embed="rId141"/>
                     <a:stretch>
                       <a:fillRect/>
                     </a:stretch>
@@ -8358,7 +9720,7 @@
         </w:drawing>
       </w:r>
     </w:p>
-    <w:bookmarkEnd w:id="143"/>
+    <w:bookmarkEnd w:id="147"/>
     <w:sectPr>
       <w:pgSz w:h="15840" w:w="12240"/>
       <w:pgMar w:bottom="720" w:footer="720" w:gutter="0" w:header="720" w:left="1152" w:right="720" w:top="720"/>

</xml_diff>

<commit_message>
fixed slope and such in 9
</commit_message>
<xml_diff>
--- a/docs/ecostats_lectures/lecture_09/09_01_lecture_powerpoint.docx
+++ b/docs/ecostats_lectures/lecture_09/09_01_lecture_powerpoint.docx
@@ -3874,7 +3874,7 @@
         <w:pStyle w:val="FirstParagraph"/>
       </w:pPr>
       <w:r>
-        <w:t xml:space="preserve">The calculation for slope (b) is:</w:t>
+        <w:t xml:space="preserve">The calculation for slope (m) is:</w:t>
       </w:r>
       <w:r>
         <w:br/>
@@ -3890,7 +3890,7 @@
         </m:oMathParaPr>
         <m:oMath>
           <m:r>
-            <m:t>b</m:t>
+            <m:t>m</m:t>
           </m:r>
           <m:r>
             <m:rPr>
@@ -4380,14 +4380,14 @@
         <w:pStyle w:val="BodyText"/>
       </w:pPr>
       <w:r>
-        <w:t xml:space="preserve">Intercept (a):</w:t>
+        <w:t xml:space="preserve">Intercept (b):</w:t>
       </w:r>
       <w:r>
         <w:t xml:space="preserve"> </w:t>
       </w:r>
       <m:oMath>
         <m:r>
-          <m:t>a</m:t>
+          <m:t>b</m:t>
         </m:r>
         <m:r>
           <m:rPr>
@@ -4412,7 +4412,7 @@
           <m:t>−</m:t>
         </m:r>
         <m:r>
-          <m:t>b</m:t>
+          <m:t>m</m:t>
         </m:r>
         <m:acc>
           <m:accPr>

</xml_diff>